<commit_message>
Complete upstream llama.cpp formal workbook
</commit_message>
<xml_diff>
--- a/docs/testing/workbooks/generated/01_Upstream_llama.cpp_Controlled_Retest_Workbook_v1.docx
+++ b/docs/testing/workbooks/generated/01_Upstream_llama.cpp_Controlled_Retest_Workbook_v1.docx
@@ -8,7 +8,7 @@
         <w:jc w:val="center"/>
       </w:pPr>
       <w:r>
-        <w:t>01 Upstream llama.cpp Controlled Retest Workbook v1.2</w:t>
+        <w:t>01 Upstream llama.cpp Controlled Retest Workbook v1.4</w:t>
       </w:r>
     </w:p>
     <w:p>
@@ -539,6 +539,261 @@
                 <w:sz w:val="14"/>
               </w:rPr>
               <w:t>testing/workbook-control-baseline-repair; #21; Pending merge; base 4bee757fb8ad40986df33df7e352526bfa4e7338</w:t>
+            </w:r>
+          </w:p>
+        </w:tc>
+        <w:tc>
+          <w:tcPr>
+            <w:tcW w:type="dxa" w:w="2078"/>
+            <w:vAlign w:val="center"/>
+          </w:tcPr>
+          <w:p>
+            <w:pPr>
+              <w:spacing w:after="0"/>
+            </w:pPr>
+            <w:r>
+              <w:rPr>
+                <w:sz w:val="14"/>
+              </w:rPr>
+              <w:t>Superseded</w:t>
+            </w:r>
+          </w:p>
+        </w:tc>
+      </w:tr>
+      <w:tr>
+        <w:trPr>
+          <w:cantSplit/>
+        </w:trPr>
+        <w:tc>
+          <w:tcPr>
+            <w:tcW w:type="dxa" w:w="2078"/>
+            <w:vAlign w:val="center"/>
+            <w:shd w:fill="EAF2F8"/>
+          </w:tcPr>
+          <w:p>
+            <w:pPr>
+              <w:spacing w:after="0"/>
+            </w:pPr>
+            <w:r>
+              <w:rPr>
+                <w:sz w:val="14"/>
+              </w:rPr>
+              <w:t>1.3</w:t>
+            </w:r>
+          </w:p>
+        </w:tc>
+        <w:tc>
+          <w:tcPr>
+            <w:tcW w:type="dxa" w:w="2078"/>
+            <w:vAlign w:val="center"/>
+            <w:shd w:fill="EAF2F8"/>
+          </w:tcPr>
+          <w:p>
+            <w:pPr>
+              <w:spacing w:after="0"/>
+            </w:pPr>
+            <w:r>
+              <w:rPr>
+                <w:sz w:val="14"/>
+              </w:rPr>
+              <w:t>2026-07-15</w:t>
+            </w:r>
+          </w:p>
+        </w:tc>
+        <w:tc>
+          <w:tcPr>
+            <w:tcW w:type="dxa" w:w="2078"/>
+            <w:vAlign w:val="center"/>
+            <w:shd w:fill="EAF2F8"/>
+          </w:tcPr>
+          <w:p>
+            <w:pPr>
+              <w:spacing w:after="0"/>
+            </w:pPr>
+            <w:r>
+              <w:rPr>
+                <w:sz w:val="14"/>
+              </w:rPr>
+              <w:t>Student</w:t>
+            </w:r>
+          </w:p>
+        </w:tc>
+        <w:tc>
+          <w:tcPr>
+            <w:tcW w:type="dxa" w:w="2078"/>
+            <w:vAlign w:val="center"/>
+            <w:shd w:fill="EAF2F8"/>
+          </w:tcPr>
+          <w:p>
+            <w:pPr>
+              <w:spacing w:after="0"/>
+            </w:pPr>
+            <w:r>
+              <w:rPr>
+                <w:sz w:val="14"/>
+              </w:rPr>
+              <w:t>Completed the upstream llama.cpp CPU and Vulkan formal matrix; recorded conservative quality scores and exact missing-data classifications; blocked SYCL after its repository gate failed.</w:t>
+            </w:r>
+          </w:p>
+        </w:tc>
+        <w:tc>
+          <w:tcPr>
+            <w:tcW w:type="dxa" w:w="2078"/>
+            <w:vAlign w:val="center"/>
+            <w:shd w:fill="EAF2F8"/>
+          </w:tcPr>
+          <w:p>
+            <w:pPr>
+              <w:spacing w:after="0"/>
+            </w:pPr>
+            <w:r>
+              <w:rPr>
+                <w:sz w:val="14"/>
+              </w:rPr>
+              <w:t>None</w:t>
+            </w:r>
+          </w:p>
+        </w:tc>
+        <w:tc>
+          <w:tcPr>
+            <w:tcW w:type="dxa" w:w="2078"/>
+            <w:vAlign w:val="center"/>
+            <w:shd w:fill="EAF2F8"/>
+          </w:tcPr>
+          <w:p>
+            <w:pPr>
+              <w:spacing w:after="0"/>
+            </w:pPr>
+            <w:r>
+              <w:rPr>
+                <w:sz w:val="14"/>
+              </w:rPr>
+              <w:t>testing/upstream-llama-cpp-formal-execution; Pending PR; Pending merge</w:t>
+            </w:r>
+          </w:p>
+        </w:tc>
+        <w:tc>
+          <w:tcPr>
+            <w:tcW w:type="dxa" w:w="2078"/>
+            <w:vAlign w:val="center"/>
+            <w:shd w:fill="EAF2F8"/>
+          </w:tcPr>
+          <w:p>
+            <w:pPr>
+              <w:spacing w:after="0"/>
+            </w:pPr>
+            <w:r>
+              <w:rPr>
+                <w:sz w:val="14"/>
+              </w:rPr>
+              <w:t>Superseded</w:t>
+            </w:r>
+          </w:p>
+        </w:tc>
+      </w:tr>
+      <w:tr>
+        <w:trPr>
+          <w:cantSplit/>
+        </w:trPr>
+        <w:tc>
+          <w:tcPr>
+            <w:tcW w:type="dxa" w:w="2078"/>
+            <w:vAlign w:val="center"/>
+          </w:tcPr>
+          <w:p>
+            <w:pPr>
+              <w:spacing w:after="0"/>
+            </w:pPr>
+            <w:r>
+              <w:rPr>
+                <w:sz w:val="14"/>
+              </w:rPr>
+              <w:t>1.4</w:t>
+            </w:r>
+          </w:p>
+        </w:tc>
+        <w:tc>
+          <w:tcPr>
+            <w:tcW w:type="dxa" w:w="2078"/>
+            <w:vAlign w:val="center"/>
+          </w:tcPr>
+          <w:p>
+            <w:pPr>
+              <w:spacing w:after="0"/>
+            </w:pPr>
+            <w:r>
+              <w:rPr>
+                <w:sz w:val="14"/>
+              </w:rPr>
+              <w:t>2026-07-16</w:t>
+            </w:r>
+          </w:p>
+        </w:tc>
+        <w:tc>
+          <w:tcPr>
+            <w:tcW w:type="dxa" w:w="2078"/>
+            <w:vAlign w:val="center"/>
+          </w:tcPr>
+          <w:p>
+            <w:pPr>
+              <w:spacing w:after="0"/>
+            </w:pPr>
+            <w:r>
+              <w:rPr>
+                <w:sz w:val="14"/>
+              </w:rPr>
+              <w:t>Student</w:t>
+            </w:r>
+          </w:p>
+        </w:tc>
+        <w:tc>
+          <w:tcPr>
+            <w:tcW w:type="dxa" w:w="2078"/>
+            <w:vAlign w:val="center"/>
+          </w:tcPr>
+          <w:p>
+            <w:pPr>
+              <w:spacing w:after="0"/>
+            </w:pPr>
+            <w:r>
+              <w:rPr>
+                <w:sz w:val="14"/>
+              </w:rPr>
+              <w:t>Measured peak RAM runtime KV allocation and TTFT with one warm-up plus three recorded samples for every UL row; completed UL-01 and UL-13 quality coverage; proved the UL-13 Granite workload passes while retaining the 49/52 SYCL edge-suite limitation.</w:t>
+            </w:r>
+          </w:p>
+        </w:tc>
+        <w:tc>
+          <w:tcPr>
+            <w:tcW w:type="dxa" w:w="2078"/>
+            <w:vAlign w:val="center"/>
+          </w:tcPr>
+          <w:p>
+            <w:pPr>
+              <w:spacing w:after="0"/>
+            </w:pPr>
+            <w:r>
+              <w:rPr>
+                <w:sz w:val="14"/>
+              </w:rPr>
+              <w:t>None</w:t>
+            </w:r>
+          </w:p>
+        </w:tc>
+        <w:tc>
+          <w:tcPr>
+            <w:tcW w:type="dxa" w:w="2078"/>
+            <w:vAlign w:val="center"/>
+          </w:tcPr>
+          <w:p>
+            <w:pPr>
+              <w:spacing w:after="0"/>
+            </w:pPr>
+            <w:r>
+              <w:rPr>
+                <w:sz w:val="14"/>
+              </w:rPr>
+              <w:t>testing/upstream-llama-cpp-formal-execution; Pending PR; Pending merge</w:t>
             </w:r>
           </w:p>
         </w:tc>
@@ -641,7 +896,7 @@
         <w:spacing w:after="60"/>
       </w:pPr>
       <w:r>
-        <w:t>Controlled retest template v1.2. Historical results were removed from this working copy; the original source document is preserved under docs/testing/source-material/original-workbooks/.</w:t>
+        <w:t>Controlled retest template v1.4. Historical results were removed from this working copy; the original source document is preserved under docs/testing/source-material/original-workbooks/.</w:t>
       </w:r>
     </w:p>
     <w:p>
@@ -794,6 +1049,7 @@
               <w:rPr>
                 <w:sz w:val="14"/>
               </w:rPr>
+              <w:t>b9870</w:t>
             </w:r>
           </w:p>
         </w:tc>
@@ -832,6 +1088,7 @@
               <w:rPr>
                 <w:sz w:val="14"/>
               </w:rPr>
+              <w:t>2d973636e292ee6f75fadcf08d29cb33511f509f</w:t>
             </w:r>
           </w:p>
         </w:tc>
@@ -872,6 +1129,7 @@
               <w:rPr>
                 <w:sz w:val="14"/>
               </w:rPr>
+              <w:t>Release; CPU-only static, Vulkan static, and SYCL static builds</w:t>
             </w:r>
           </w:p>
         </w:tc>
@@ -910,6 +1168,7 @@
               <w:rPr>
                 <w:sz w:val="14"/>
               </w:rPr>
+              <w:t>MSVC via Visual Studio 18 2026; CMake 4.3.1-msvc1; Vulkan SDK 1.4.350.0; Intel oneAPI 2026.1 SYCL</w:t>
             </w:r>
           </w:p>
         </w:tc>
@@ -950,6 +1209,7 @@
               <w:rPr>
                 <w:sz w:val="14"/>
               </w:rPr>
+              <w:t>b9870</w:t>
             </w:r>
           </w:p>
         </w:tc>
@@ -988,6 +1248,7 @@
               <w:rPr>
                 <w:sz w:val="14"/>
               </w:rPr>
+              <w:t>Student</w:t>
             </w:r>
           </w:p>
         </w:tc>
@@ -1028,6 +1289,7 @@
               <w:rPr>
                 <w:sz w:val="14"/>
               </w:rPr>
+              <w:t>2026-07-14</w:t>
             </w:r>
           </w:p>
         </w:tc>
@@ -1066,6 +1328,7 @@
               <w:rPr>
                 <w:sz w:val="14"/>
               </w:rPr>
+              <w:t>2026-07-16</w:t>
             </w:r>
           </w:p>
         </w:tc>
@@ -1106,6 +1369,7 @@
               <w:rPr>
                 <w:sz w:val="14"/>
               </w:rPr>
+              <w:t>Conditional pass - UL-01 to UL-13 project workloads completed; CPU and Vulkan suites pass 52/52; the broader SYCL suite retains three edge-case failures at 49/52.</w:t>
             </w:r>
           </w:p>
         </w:tc>
@@ -1244,6 +1508,7 @@
               <w:rPr>
                 <w:sz w:val="14"/>
               </w:rPr>
+              <w:t>Confirmed as LENOVO-PF4HMD0T</w:t>
             </w:r>
           </w:p>
         </w:tc>
@@ -1302,6 +1567,7 @@
               <w:rPr>
                 <w:sz w:val="14"/>
               </w:rPr>
+              <w:t>Confirmed: 12th Gen Intel Core i5-12450H, 8 physical cores, 12 logical processors</w:t>
             </w:r>
           </w:p>
         </w:tc>
@@ -1357,6 +1623,7 @@
               <w:rPr>
                 <w:sz w:val="14"/>
               </w:rPr>
+              <w:t>Confirmed: 16,857,817,088 bytes installed</w:t>
             </w:r>
           </w:p>
         </w:tc>
@@ -1415,6 +1682,7 @@
               <w:rPr>
                 <w:sz w:val="14"/>
               </w:rPr>
+              <w:t>Confirmed: Intel UHD Graphics, driver 32.0.101.7076</w:t>
             </w:r>
           </w:p>
         </w:tc>
@@ -1470,6 +1738,7 @@
               <w:rPr>
                 <w:sz w:val="14"/>
               </w:rPr>
+              <w:t>Updated: Windows 11 Home 10.0.26200 build 26200, 64-bit</w:t>
             </w:r>
           </w:p>
         </w:tc>
@@ -1528,6 +1797,7 @@
               <w:rPr>
                 <w:sz w:val="14"/>
               </w:rPr>
+              <w:t>Confirmed: no NPU recorded; excluded</w:t>
             </w:r>
           </w:p>
         </w:tc>
@@ -1702,6 +1972,7 @@
               <w:rPr>
                 <w:sz w:val="14"/>
               </w:rPr>
+              <w:t>Passed</w:t>
             </w:r>
           </w:p>
         </w:tc>
@@ -1718,6 +1989,7 @@
               <w:rPr>
                 <w:sz w:val="14"/>
               </w:rPr>
+              <w:t>Official tag b9870 resolved to pinned commit; clean tree verified after Windows long-path recovery.</w:t>
             </w:r>
           </w:p>
         </w:tc>
@@ -1734,6 +2006,7 @@
               <w:rPr>
                 <w:sz w:val="14"/>
               </w:rPr>
+              <w:t>experiments/granite_turboquant_intel/notes/upstream-llama-cpp/UL-B01/UL-B01-R004/Windows-Long-Path-Recovery.md</w:t>
             </w:r>
           </w:p>
         </w:tc>
@@ -1792,6 +2065,7 @@
               <w:rPr>
                 <w:sz w:val="14"/>
               </w:rPr>
+              <w:t>Passed</w:t>
             </w:r>
           </w:p>
         </w:tc>
@@ -1809,6 +2083,7 @@
               <w:rPr>
                 <w:sz w:val="14"/>
               </w:rPr>
+              <w:t>Clean x64 CPU static Release configuration; local and prebuilt UI disabled.</w:t>
             </w:r>
           </w:p>
         </w:tc>
@@ -1826,6 +2101,7 @@
               <w:rPr>
                 <w:sz w:val="14"/>
               </w:rPr>
+              <w:t>experiments/granite_turboquant_intel/logs/upstream-llama-cpp/UL-B02/UL-B02-R002/</w:t>
             </w:r>
           </w:p>
         </w:tc>
@@ -1881,6 +2157,7 @@
               <w:rPr>
                 <w:sz w:val="14"/>
               </w:rPr>
+              <w:t>Passed</w:t>
             </w:r>
           </w:p>
         </w:tc>
@@ -1897,6 +2174,7 @@
               <w:rPr>
                 <w:sz w:val="14"/>
               </w:rPr>
+              <w:t>Corrected build produced the four required binaries; initial UI asset failure preserved.</w:t>
             </w:r>
           </w:p>
         </w:tc>
@@ -1913,6 +2191,7 @@
               <w:rPr>
                 <w:sz w:val="14"/>
               </w:rPr>
+              <w:t>experiments/granite_turboquant_intel/notes/upstream-llama-cpp/UL-B03/UL-B03-R002/binary-inventory.csv</w:t>
             </w:r>
           </w:p>
         </w:tc>
@@ -1971,6 +2250,7 @@
               <w:rPr>
                 <w:sz w:val="14"/>
               </w:rPr>
+              <w:t>Passed</w:t>
             </w:r>
           </w:p>
         </w:tc>
@@ -1988,6 +2268,7 @@
               <w:rPr>
                 <w:sz w:val="14"/>
               </w:rPr>
+              <w:t>UL-B04-R002 passed 52/52 after adding Jinja2 3.1.6 to the isolated Python environment.</w:t>
             </w:r>
           </w:p>
         </w:tc>
@@ -2005,6 +2286,7 @@
               <w:rPr>
                 <w:sz w:val="14"/>
               </w:rPr>
+              <w:t>experiments/granite_turboquant_intel/logs/upstream-llama-cpp/UL-B04/UL-B04-R002/ctest-stdout.txt</w:t>
             </w:r>
           </w:p>
         </w:tc>
@@ -2060,6 +2342,7 @@
               <w:rPr>
                 <w:sz w:val="14"/>
               </w:rPr>
+              <w:t>Passed</w:t>
             </w:r>
           </w:p>
         </w:tc>
@@ -2076,6 +2359,7 @@
               <w:rPr>
                 <w:sz w:val="14"/>
               </w:rPr>
+              <w:t>R001 was a CRLF regex false negative; R002 built Vulkan successfully; R003 passed 52/52 tests in 640.35 s.</w:t>
             </w:r>
           </w:p>
         </w:tc>
@@ -2092,6 +2376,7 @@
               <w:rPr>
                 <w:sz w:val="14"/>
               </w:rPr>
+              <w:t>experiments/granite_turboquant_intel/notes/upstream-llama-cpp/UL-B05/UL-B05-R003/run-summary.json</w:t>
             </w:r>
           </w:p>
         </w:tc>
@@ -2150,6 +2435,7 @@
               <w:rPr>
                 <w:sz w:val="14"/>
               </w:rPr>
+              <w:t>Passed with edge-suite limitation</w:t>
             </w:r>
           </w:p>
         </w:tc>
@@ -2167,6 +2453,7 @@
               <w:rPr>
                 <w:sz w:val="14"/>
               </w:rPr>
+              <w:t>oneAPI 2026.1 configured and all 619 targets built. The Granite project workload passes on SYCL0, while the broad repository suite remains 49/52 because of FP64 and device-loss edge cases.</w:t>
             </w:r>
           </w:p>
         </w:tc>
@@ -2184,6 +2471,7 @@
               <w:rPr>
                 <w:sz w:val="14"/>
               </w:rPr>
+              <w:t>experiments/granite_turboquant_intel/logs/upstream-llama-cpp/UL-B06/UL-B06-R002/build-stdout.txt</w:t>
             </w:r>
           </w:p>
         </w:tc>
@@ -2239,6 +2527,7 @@
               <w:rPr>
                 <w:sz w:val="14"/>
               </w:rPr>
+              <w:t>Passed with limitation</w:t>
             </w:r>
           </w:p>
         </w:tc>
@@ -2255,6 +2544,7 @@
               <w:rPr>
                 <w:sz w:val="14"/>
               </w:rPr>
+              <w:t>CPU, Vulkan and SYCL capabilities captured; the project SYCL route is usable, but three broad upstream tests remain unresolved.</w:t>
             </w:r>
           </w:p>
         </w:tc>
@@ -2271,6 +2561,7 @@
               <w:rPr>
                 <w:sz w:val="14"/>
               </w:rPr>
+              <w:t>experiments/granite_turboquant_intel/notes/upstream-llama-cpp/UL-B06/UL-B06-R002/repository-test-failure-analysis.md</w:t>
             </w:r>
           </w:p>
         </w:tc>
@@ -2584,6 +2875,7 @@
               <w:rPr>
                 <w:sz w:val="14"/>
               </w:rPr>
+              <w:t>Passed</w:t>
             </w:r>
           </w:p>
         </w:tc>
@@ -2732,6 +3024,7 @@
               <w:rPr>
                 <w:sz w:val="14"/>
               </w:rPr>
+              <w:t>Passed</w:t>
             </w:r>
           </w:p>
         </w:tc>
@@ -2872,6 +3165,7 @@
               <w:rPr>
                 <w:sz w:val="14"/>
               </w:rPr>
+              <w:t>Passed</w:t>
             </w:r>
           </w:p>
         </w:tc>
@@ -3020,6 +3314,7 @@
               <w:rPr>
                 <w:sz w:val="14"/>
               </w:rPr>
+              <w:t>Passed</w:t>
             </w:r>
           </w:p>
         </w:tc>
@@ -3160,6 +3455,7 @@
               <w:rPr>
                 <w:sz w:val="14"/>
               </w:rPr>
+              <w:t>Passed with quality caveats</w:t>
             </w:r>
           </w:p>
         </w:tc>
@@ -3308,6 +3604,7 @@
               <w:rPr>
                 <w:sz w:val="14"/>
               </w:rPr>
+              <w:t>Passed</w:t>
             </w:r>
           </w:p>
         </w:tc>
@@ -3448,6 +3745,7 @@
               <w:rPr>
                 <w:sz w:val="14"/>
               </w:rPr>
+              <w:t>Passed with quality caveat</w:t>
             </w:r>
           </w:p>
         </w:tc>
@@ -3596,6 +3894,7 @@
               <w:rPr>
                 <w:sz w:val="14"/>
               </w:rPr>
+              <w:t>Passed with quality caveats</w:t>
             </w:r>
           </w:p>
         </w:tc>
@@ -3736,6 +4035,7 @@
               <w:rPr>
                 <w:sz w:val="14"/>
               </w:rPr>
+              <w:t>Passed</w:t>
             </w:r>
           </w:p>
         </w:tc>
@@ -3884,6 +4184,7 @@
               <w:rPr>
                 <w:sz w:val="14"/>
               </w:rPr>
+              <w:t>Passed; decode regression</w:t>
             </w:r>
           </w:p>
         </w:tc>
@@ -4024,6 +4325,7 @@
               <w:rPr>
                 <w:sz w:val="14"/>
               </w:rPr>
+              <w:t>Passed</w:t>
             </w:r>
           </w:p>
         </w:tc>
@@ -4172,6 +4474,7 @@
               <w:rPr>
                 <w:sz w:val="14"/>
               </w:rPr>
+              <w:t>Passed; decode regression</w:t>
             </w:r>
           </w:p>
         </w:tc>
@@ -4312,6 +4615,7 @@
               <w:rPr>
                 <w:sz w:val="14"/>
               </w:rPr>
+              <w:t>Passed project workload; edge-suite limitation</w:t>
             </w:r>
           </w:p>
         </w:tc>
@@ -4573,6 +4877,7 @@
               <w:rPr>
                 <w:sz w:val="14"/>
               </w:rPr>
+              <w:t>Yes</w:t>
             </w:r>
           </w:p>
         </w:tc>
@@ -4589,6 +4894,7 @@
               <w:rPr>
                 <w:sz w:val="14"/>
               </w:rPr>
+              <w:t>Yes, UL-02</w:t>
             </w:r>
           </w:p>
         </w:tc>
@@ -4701,6 +5007,7 @@
               <w:rPr>
                 <w:sz w:val="14"/>
               </w:rPr>
+              <w:t>Yes</w:t>
             </w:r>
           </w:p>
         </w:tc>
@@ -4718,6 +5025,7 @@
               <w:rPr>
                 <w:sz w:val="14"/>
               </w:rPr>
+              <w:t>Yes, UL-03</w:t>
             </w:r>
           </w:p>
         </w:tc>
@@ -4824,6 +5132,7 @@
               <w:rPr>
                 <w:sz w:val="14"/>
               </w:rPr>
+              <w:t>Not available in supplied model set</w:t>
             </w:r>
           </w:p>
         </w:tc>
@@ -4840,6 +5149,7 @@
               <w:rPr>
                 <w:sz w:val="14"/>
               </w:rPr>
+              <w:t>No</w:t>
             </w:r>
           </w:p>
         </w:tc>
@@ -4952,6 +5262,7 @@
               <w:rPr>
                 <w:sz w:val="14"/>
               </w:rPr>
+              <w:t>Yes</w:t>
             </w:r>
           </w:p>
         </w:tc>
@@ -4969,6 +5280,7 @@
               <w:rPr>
                 <w:sz w:val="14"/>
               </w:rPr>
+              <w:t>Yes, UL-04 and UL-07</w:t>
             </w:r>
           </w:p>
         </w:tc>
@@ -5075,6 +5387,7 @@
               <w:rPr>
                 <w:sz w:val="14"/>
               </w:rPr>
+              <w:t>Yes</w:t>
             </w:r>
           </w:p>
         </w:tc>
@@ -5091,6 +5404,7 @@
               <w:rPr>
                 <w:sz w:val="14"/>
               </w:rPr>
+              <w:t>Yes, UL-05 and UL-08</w:t>
             </w:r>
           </w:p>
         </w:tc>
@@ -5203,6 +5517,7 @@
               <w:rPr>
                 <w:sz w:val="14"/>
               </w:rPr>
+              <w:t>Backend supports it; excluded by approved matrix</w:t>
             </w:r>
           </w:p>
         </w:tc>
@@ -5220,6 +5535,7 @@
               <w:rPr>
                 <w:sz w:val="14"/>
               </w:rPr>
+              <w:t>No</w:t>
             </w:r>
           </w:p>
         </w:tc>
@@ -5326,6 +5642,7 @@
               <w:rPr>
                 <w:sz w:val="14"/>
               </w:rPr>
+              <w:t>Yes; SYCL has edge-suite limitations</w:t>
             </w:r>
           </w:p>
         </w:tc>
@@ -5342,6 +5659,7 @@
               <w:rPr>
                 <w:sz w:val="14"/>
               </w:rPr>
+              <w:t>Vulkan UL-09 to UL-12; SYCL UL-13</w:t>
             </w:r>
           </w:p>
         </w:tc>
@@ -5454,6 +5772,7 @@
               <w:rPr>
                 <w:sz w:val="14"/>
               </w:rPr>
+              <w:t>Yes</w:t>
             </w:r>
           </w:p>
         </w:tc>
@@ -5471,6 +5790,7 @@
               <w:rPr>
                 <w:sz w:val="14"/>
               </w:rPr>
+              <w:t>Yes, UL-06</w:t>
             </w:r>
           </w:p>
         </w:tc>
@@ -5577,6 +5897,7 @@
               <w:rPr>
                 <w:sz w:val="14"/>
               </w:rPr>
+              <w:t>Yes</w:t>
             </w:r>
           </w:p>
         </w:tc>
@@ -5593,6 +5914,7 @@
               <w:rPr>
                 <w:sz w:val="14"/>
               </w:rPr>
+              <w:t>Yes, UL-07</w:t>
             </w:r>
           </w:p>
         </w:tc>
@@ -5705,6 +6027,7 @@
               <w:rPr>
                 <w:sz w:val="14"/>
               </w:rPr>
+              <w:t>Yes</w:t>
             </w:r>
           </w:p>
         </w:tc>
@@ -5722,6 +6045,7 @@
               <w:rPr>
                 <w:sz w:val="14"/>
               </w:rPr>
+              <w:t>Yes, UL-08</w:t>
             </w:r>
           </w:p>
         </w:tc>
@@ -5828,6 +6152,7 @@
               <w:rPr>
                 <w:sz w:val="14"/>
               </w:rPr>
+              <w:t>Yes</w:t>
             </w:r>
           </w:p>
         </w:tc>
@@ -5844,6 +6169,7 @@
               <w:rPr>
                 <w:sz w:val="14"/>
               </w:rPr>
+              <w:t>Yes, UL-09</w:t>
             </w:r>
           </w:p>
         </w:tc>
@@ -5956,6 +6282,7 @@
               <w:rPr>
                 <w:sz w:val="14"/>
               </w:rPr>
+              <w:t>Yes</w:t>
             </w:r>
           </w:p>
         </w:tc>
@@ -5973,6 +6300,7 @@
               <w:rPr>
                 <w:sz w:val="14"/>
               </w:rPr>
+              <w:t>Yes, UL-10</w:t>
             </w:r>
           </w:p>
         </w:tc>
@@ -6079,6 +6407,7 @@
               <w:rPr>
                 <w:sz w:val="14"/>
               </w:rPr>
+              <w:t>Yes</w:t>
             </w:r>
           </w:p>
         </w:tc>
@@ -6095,6 +6424,7 @@
               <w:rPr>
                 <w:sz w:val="14"/>
               </w:rPr>
+              <w:t>Yes, UL-11</w:t>
             </w:r>
           </w:p>
         </w:tc>
@@ -6207,6 +6537,7 @@
               <w:rPr>
                 <w:sz w:val="14"/>
               </w:rPr>
+              <w:t>Yes</w:t>
             </w:r>
           </w:p>
         </w:tc>
@@ -6224,6 +6555,7 @@
               <w:rPr>
                 <w:sz w:val="14"/>
               </w:rPr>
+              <w:t>Yes, UL-12</w:t>
             </w:r>
           </w:p>
         </w:tc>
@@ -6330,6 +6662,7 @@
               <w:rPr>
                 <w:sz w:val="14"/>
               </w:rPr>
+              <w:t>Project workload supported; edge suite 49/52</w:t>
             </w:r>
           </w:p>
         </w:tc>
@@ -6346,6 +6679,7 @@
               <w:rPr>
                 <w:sz w:val="14"/>
               </w:rPr>
+              <w:t>Yes, UL-13</w:t>
             </w:r>
           </w:p>
         </w:tc>
@@ -6528,7 +6862,7 @@
                 <w:color w:val="FFFFFF"/>
                 <w:sz w:val="14"/>
               </w:rPr>
-              <w:t>CPU %</w:t>
+              <w:t>CPU layer placement</w:t>
             </w:r>
           </w:p>
         </w:tc>
@@ -6545,7 +6879,7 @@
                 <w:color w:val="FFFFFF"/>
                 <w:sz w:val="14"/>
               </w:rPr>
-              <w:t>GPU %</w:t>
+              <w:t>GPU layer placement</w:t>
             </w:r>
           </w:p>
         </w:tc>
@@ -6618,6 +6952,7 @@
               <w:rPr>
                 <w:sz w:val="14"/>
               </w:rPr>
+              <w:t>CPU</w:t>
             </w:r>
           </w:p>
         </w:tc>
@@ -6634,6 +6969,7 @@
               <w:rPr>
                 <w:sz w:val="14"/>
               </w:rPr>
+              <w:t>CPU</w:t>
             </w:r>
           </w:p>
         </w:tc>
@@ -6650,6 +6986,7 @@
               <w:rPr>
                 <w:sz w:val="14"/>
               </w:rPr>
+              <w:t>None</w:t>
             </w:r>
           </w:p>
         </w:tc>
@@ -6666,6 +7003,7 @@
               <w:rPr>
                 <w:sz w:val="14"/>
               </w:rPr>
+              <w:t>N/A upstream</w:t>
             </w:r>
           </w:p>
         </w:tc>
@@ -6682,6 +7020,7 @@
               <w:rPr>
                 <w:sz w:val="14"/>
               </w:rPr>
+              <w:t>No</w:t>
             </w:r>
           </w:p>
         </w:tc>
@@ -6698,6 +7037,7 @@
               <w:rPr>
                 <w:sz w:val="14"/>
               </w:rPr>
+              <w:t>100% layer placement</w:t>
             </w:r>
           </w:p>
         </w:tc>
@@ -6714,6 +7054,7 @@
               <w:rPr>
                 <w:sz w:val="14"/>
               </w:rPr>
+              <w:t>0% layer placement</w:t>
             </w:r>
           </w:p>
         </w:tc>
@@ -6730,6 +7071,7 @@
               <w:rPr>
                 <w:sz w:val="14"/>
               </w:rPr>
+              <w:t>experiments/granite_turboquant_intel/logs/upstream-llama-cpp/UL-01/UL-01-R003/bench-stderr.jsonl</w:t>
             </w:r>
           </w:p>
         </w:tc>
@@ -6788,6 +7130,7 @@
               <w:rPr>
                 <w:sz w:val="14"/>
               </w:rPr>
+              <w:t>CPU</w:t>
             </w:r>
           </w:p>
         </w:tc>
@@ -6805,6 +7148,7 @@
               <w:rPr>
                 <w:sz w:val="14"/>
               </w:rPr>
+              <w:t>CPU</w:t>
             </w:r>
           </w:p>
         </w:tc>
@@ -6822,6 +7166,7 @@
               <w:rPr>
                 <w:sz w:val="14"/>
               </w:rPr>
+              <w:t>None</w:t>
             </w:r>
           </w:p>
         </w:tc>
@@ -6839,6 +7184,7 @@
               <w:rPr>
                 <w:sz w:val="14"/>
               </w:rPr>
+              <w:t>N/A upstream</w:t>
             </w:r>
           </w:p>
         </w:tc>
@@ -6856,6 +7202,7 @@
               <w:rPr>
                 <w:sz w:val="14"/>
               </w:rPr>
+              <w:t>No</w:t>
             </w:r>
           </w:p>
         </w:tc>
@@ -6873,6 +7220,7 @@
               <w:rPr>
                 <w:sz w:val="14"/>
               </w:rPr>
+              <w:t>100% layer placement</w:t>
             </w:r>
           </w:p>
         </w:tc>
@@ -6890,6 +7238,7 @@
               <w:rPr>
                 <w:sz w:val="14"/>
               </w:rPr>
+              <w:t>0% layer placement</w:t>
             </w:r>
           </w:p>
         </w:tc>
@@ -6907,6 +7256,7 @@
               <w:rPr>
                 <w:sz w:val="14"/>
               </w:rPr>
+              <w:t>experiments/granite_turboquant_intel/logs/upstream-llama-cpp/UL-02/UL-02-R001/bench-stderr.jsonl</w:t>
             </w:r>
           </w:p>
         </w:tc>
@@ -6962,6 +7312,7 @@
               <w:rPr>
                 <w:sz w:val="14"/>
               </w:rPr>
+              <w:t>CPU</w:t>
             </w:r>
           </w:p>
         </w:tc>
@@ -6978,6 +7329,7 @@
               <w:rPr>
                 <w:sz w:val="14"/>
               </w:rPr>
+              <w:t>CPU</w:t>
             </w:r>
           </w:p>
         </w:tc>
@@ -6994,6 +7346,7 @@
               <w:rPr>
                 <w:sz w:val="14"/>
               </w:rPr>
+              <w:t>None</w:t>
             </w:r>
           </w:p>
         </w:tc>
@@ -7010,6 +7363,7 @@
               <w:rPr>
                 <w:sz w:val="14"/>
               </w:rPr>
+              <w:t>N/A upstream</w:t>
             </w:r>
           </w:p>
         </w:tc>
@@ -7026,6 +7380,7 @@
               <w:rPr>
                 <w:sz w:val="14"/>
               </w:rPr>
+              <w:t>No</w:t>
             </w:r>
           </w:p>
         </w:tc>
@@ -7042,6 +7397,7 @@
               <w:rPr>
                 <w:sz w:val="14"/>
               </w:rPr>
+              <w:t>100% layer placement</w:t>
             </w:r>
           </w:p>
         </w:tc>
@@ -7058,6 +7414,7 @@
               <w:rPr>
                 <w:sz w:val="14"/>
               </w:rPr>
+              <w:t>0% layer placement</w:t>
             </w:r>
           </w:p>
         </w:tc>
@@ -7074,6 +7431,7 @@
               <w:rPr>
                 <w:sz w:val="14"/>
               </w:rPr>
+              <w:t>experiments/granite_turboquant_intel/logs/upstream-llama-cpp/UL-03/UL-03-R001/bench-stderr.jsonl</w:t>
             </w:r>
           </w:p>
         </w:tc>
@@ -7132,6 +7490,7 @@
               <w:rPr>
                 <w:sz w:val="14"/>
               </w:rPr>
+              <w:t>CPU</w:t>
             </w:r>
           </w:p>
         </w:tc>
@@ -7149,6 +7508,7 @@
               <w:rPr>
                 <w:sz w:val="14"/>
               </w:rPr>
+              <w:t>CPU</w:t>
             </w:r>
           </w:p>
         </w:tc>
@@ -7166,6 +7526,7 @@
               <w:rPr>
                 <w:sz w:val="14"/>
               </w:rPr>
+              <w:t>None</w:t>
             </w:r>
           </w:p>
         </w:tc>
@@ -7183,6 +7544,7 @@
               <w:rPr>
                 <w:sz w:val="14"/>
               </w:rPr>
+              <w:t>N/A upstream</w:t>
             </w:r>
           </w:p>
         </w:tc>
@@ -7200,6 +7562,7 @@
               <w:rPr>
                 <w:sz w:val="14"/>
               </w:rPr>
+              <w:t>No</w:t>
             </w:r>
           </w:p>
         </w:tc>
@@ -7217,6 +7580,7 @@
               <w:rPr>
                 <w:sz w:val="14"/>
               </w:rPr>
+              <w:t>100% layer placement</w:t>
             </w:r>
           </w:p>
         </w:tc>
@@ -7234,6 +7598,7 @@
               <w:rPr>
                 <w:sz w:val="14"/>
               </w:rPr>
+              <w:t>0% layer placement</w:t>
             </w:r>
           </w:p>
         </w:tc>
@@ -7251,6 +7616,7 @@
               <w:rPr>
                 <w:sz w:val="14"/>
               </w:rPr>
+              <w:t>experiments/granite_turboquant_intel/logs/upstream-llama-cpp/UL-04/UL-04-R001/bench-stderr.jsonl</w:t>
             </w:r>
           </w:p>
         </w:tc>
@@ -7306,6 +7672,7 @@
               <w:rPr>
                 <w:sz w:val="14"/>
               </w:rPr>
+              <w:t>CPU</w:t>
             </w:r>
           </w:p>
         </w:tc>
@@ -7322,6 +7689,7 @@
               <w:rPr>
                 <w:sz w:val="14"/>
               </w:rPr>
+              <w:t>CPU</w:t>
             </w:r>
           </w:p>
         </w:tc>
@@ -7338,6 +7706,7 @@
               <w:rPr>
                 <w:sz w:val="14"/>
               </w:rPr>
+              <w:t>None</w:t>
             </w:r>
           </w:p>
         </w:tc>
@@ -7354,6 +7723,7 @@
               <w:rPr>
                 <w:sz w:val="14"/>
               </w:rPr>
+              <w:t>N/A upstream</w:t>
             </w:r>
           </w:p>
         </w:tc>
@@ -7370,6 +7740,7 @@
               <w:rPr>
                 <w:sz w:val="14"/>
               </w:rPr>
+              <w:t>No</w:t>
             </w:r>
           </w:p>
         </w:tc>
@@ -7386,6 +7757,7 @@
               <w:rPr>
                 <w:sz w:val="14"/>
               </w:rPr>
+              <w:t>100% layer placement</w:t>
             </w:r>
           </w:p>
         </w:tc>
@@ -7402,6 +7774,7 @@
               <w:rPr>
                 <w:sz w:val="14"/>
               </w:rPr>
+              <w:t>0% layer placement</w:t>
             </w:r>
           </w:p>
         </w:tc>
@@ -7418,6 +7791,7 @@
               <w:rPr>
                 <w:sz w:val="14"/>
               </w:rPr>
+              <w:t>experiments/granite_turboquant_intel/logs/upstream-llama-cpp/UL-05/UL-05-R001/bench-stderr.jsonl</w:t>
             </w:r>
           </w:p>
         </w:tc>
@@ -7476,6 +7850,7 @@
               <w:rPr>
                 <w:sz w:val="14"/>
               </w:rPr>
+              <w:t>CPU</w:t>
             </w:r>
           </w:p>
         </w:tc>
@@ -7493,6 +7868,7 @@
               <w:rPr>
                 <w:sz w:val="14"/>
               </w:rPr>
+              <w:t>CPU</w:t>
             </w:r>
           </w:p>
         </w:tc>
@@ -7510,6 +7886,7 @@
               <w:rPr>
                 <w:sz w:val="14"/>
               </w:rPr>
+              <w:t>None</w:t>
             </w:r>
           </w:p>
         </w:tc>
@@ -7527,6 +7904,7 @@
               <w:rPr>
                 <w:sz w:val="14"/>
               </w:rPr>
+              <w:t>N/A upstream</w:t>
             </w:r>
           </w:p>
         </w:tc>
@@ -7544,6 +7922,7 @@
               <w:rPr>
                 <w:sz w:val="14"/>
               </w:rPr>
+              <w:t>No</w:t>
             </w:r>
           </w:p>
         </w:tc>
@@ -7561,6 +7940,7 @@
               <w:rPr>
                 <w:sz w:val="14"/>
               </w:rPr>
+              <w:t>100% layer placement</w:t>
             </w:r>
           </w:p>
         </w:tc>
@@ -7578,6 +7958,7 @@
               <w:rPr>
                 <w:sz w:val="14"/>
               </w:rPr>
+              <w:t>0% layer placement</w:t>
             </w:r>
           </w:p>
         </w:tc>
@@ -7595,6 +7976,7 @@
               <w:rPr>
                 <w:sz w:val="14"/>
               </w:rPr>
+              <w:t>experiments/granite_turboquant_intel/logs/upstream-llama-cpp/UL-06/UL-06-R001/bench-stderr.jsonl</w:t>
             </w:r>
           </w:p>
         </w:tc>
@@ -7650,6 +8032,7 @@
               <w:rPr>
                 <w:sz w:val="14"/>
               </w:rPr>
+              <w:t>CPU</w:t>
             </w:r>
           </w:p>
         </w:tc>
@@ -7666,6 +8049,7 @@
               <w:rPr>
                 <w:sz w:val="14"/>
               </w:rPr>
+              <w:t>CPU</w:t>
             </w:r>
           </w:p>
         </w:tc>
@@ -7682,6 +8066,7 @@
               <w:rPr>
                 <w:sz w:val="14"/>
               </w:rPr>
+              <w:t>None</w:t>
             </w:r>
           </w:p>
         </w:tc>
@@ -7698,6 +8083,7 @@
               <w:rPr>
                 <w:sz w:val="14"/>
               </w:rPr>
+              <w:t>N/A upstream</w:t>
             </w:r>
           </w:p>
         </w:tc>
@@ -7714,6 +8100,7 @@
               <w:rPr>
                 <w:sz w:val="14"/>
               </w:rPr>
+              <w:t>No</w:t>
             </w:r>
           </w:p>
         </w:tc>
@@ -7730,6 +8117,7 @@
               <w:rPr>
                 <w:sz w:val="14"/>
               </w:rPr>
+              <w:t>100% layer placement</w:t>
             </w:r>
           </w:p>
         </w:tc>
@@ -7746,6 +8134,7 @@
               <w:rPr>
                 <w:sz w:val="14"/>
               </w:rPr>
+              <w:t>0% layer placement</w:t>
             </w:r>
           </w:p>
         </w:tc>
@@ -7762,6 +8151,7 @@
               <w:rPr>
                 <w:sz w:val="14"/>
               </w:rPr>
+              <w:t>experiments/granite_turboquant_intel/logs/upstream-llama-cpp/UL-07/UL-07-R001/bench-stderr.jsonl</w:t>
             </w:r>
           </w:p>
         </w:tc>
@@ -7820,6 +8210,7 @@
               <w:rPr>
                 <w:sz w:val="14"/>
               </w:rPr>
+              <w:t>CPU</w:t>
             </w:r>
           </w:p>
         </w:tc>
@@ -7837,6 +8228,7 @@
               <w:rPr>
                 <w:sz w:val="14"/>
               </w:rPr>
+              <w:t>CPU</w:t>
             </w:r>
           </w:p>
         </w:tc>
@@ -7854,6 +8246,7 @@
               <w:rPr>
                 <w:sz w:val="14"/>
               </w:rPr>
+              <w:t>None</w:t>
             </w:r>
           </w:p>
         </w:tc>
@@ -7871,6 +8264,7 @@
               <w:rPr>
                 <w:sz w:val="14"/>
               </w:rPr>
+              <w:t>N/A upstream</w:t>
             </w:r>
           </w:p>
         </w:tc>
@@ -7888,6 +8282,7 @@
               <w:rPr>
                 <w:sz w:val="14"/>
               </w:rPr>
+              <w:t>No</w:t>
             </w:r>
           </w:p>
         </w:tc>
@@ -7905,6 +8300,7 @@
               <w:rPr>
                 <w:sz w:val="14"/>
               </w:rPr>
+              <w:t>100% layer placement</w:t>
             </w:r>
           </w:p>
         </w:tc>
@@ -7922,6 +8318,7 @@
               <w:rPr>
                 <w:sz w:val="14"/>
               </w:rPr>
+              <w:t>0% layer placement</w:t>
             </w:r>
           </w:p>
         </w:tc>
@@ -7939,6 +8336,7 @@
               <w:rPr>
                 <w:sz w:val="14"/>
               </w:rPr>
+              <w:t>experiments/granite_turboquant_intel/logs/upstream-llama-cpp/UL-08/UL-08-R001/bench-stderr.jsonl</w:t>
             </w:r>
           </w:p>
         </w:tc>
@@ -7994,6 +8392,7 @@
               <w:rPr>
                 <w:sz w:val="14"/>
               </w:rPr>
+              <w:t>Vulkan0 plus CPU</w:t>
             </w:r>
           </w:p>
         </w:tc>
@@ -8010,6 +8409,7 @@
               <w:rPr>
                 <w:sz w:val="14"/>
               </w:rPr>
+              <w:t>Vulkan</w:t>
             </w:r>
           </w:p>
         </w:tc>
@@ -8026,6 +8426,7 @@
               <w:rPr>
                 <w:sz w:val="14"/>
               </w:rPr>
+              <w:t>1 layer</w:t>
             </w:r>
           </w:p>
         </w:tc>
@@ -8042,6 +8443,7 @@
               <w:rPr>
                 <w:sz w:val="14"/>
               </w:rPr>
+              <w:t>N/A upstream</w:t>
             </w:r>
           </w:p>
         </w:tc>
@@ -8058,6 +8460,7 @@
               <w:rPr>
                 <w:sz w:val="14"/>
               </w:rPr>
+              <w:t>Yes, 40 layers</w:t>
             </w:r>
           </w:p>
         </w:tc>
@@ -8074,6 +8477,7 @@
               <w:rPr>
                 <w:sz w:val="14"/>
               </w:rPr>
+              <w:t>97.6% model-layer placement</w:t>
             </w:r>
           </w:p>
         </w:tc>
@@ -8090,6 +8494,7 @@
               <w:rPr>
                 <w:sz w:val="14"/>
               </w:rPr>
+              <w:t>2.4% model-layer placement</w:t>
             </w:r>
           </w:p>
         </w:tc>
@@ -8106,6 +8511,7 @@
               <w:rPr>
                 <w:sz w:val="14"/>
               </w:rPr>
+              <w:t>experiments/granite_turboquant_intel/logs/upstream-llama-cpp/UL-09/UL-09-R001/bench-stderr.jsonl</w:t>
             </w:r>
           </w:p>
         </w:tc>
@@ -8164,6 +8570,7 @@
               <w:rPr>
                 <w:sz w:val="14"/>
               </w:rPr>
+              <w:t>Vulkan0</w:t>
             </w:r>
           </w:p>
         </w:tc>
@@ -8181,6 +8588,7 @@
               <w:rPr>
                 <w:sz w:val="14"/>
               </w:rPr>
+              <w:t>Vulkan</w:t>
             </w:r>
           </w:p>
         </w:tc>
@@ -8198,6 +8606,7 @@
               <w:rPr>
                 <w:sz w:val="14"/>
               </w:rPr>
+              <w:t>All 41 layers</w:t>
             </w:r>
           </w:p>
         </w:tc>
@@ -8215,6 +8624,7 @@
               <w:rPr>
                 <w:sz w:val="14"/>
               </w:rPr>
+              <w:t>N/A upstream</w:t>
             </w:r>
           </w:p>
         </w:tc>
@@ -8232,6 +8642,7 @@
               <w:rPr>
                 <w:sz w:val="14"/>
               </w:rPr>
+              <w:t>No model-layer fallback</w:t>
             </w:r>
           </w:p>
         </w:tc>
@@ -8249,6 +8660,7 @@
               <w:rPr>
                 <w:sz w:val="14"/>
               </w:rPr>
+              <w:t>0% model-layer placement</w:t>
             </w:r>
           </w:p>
         </w:tc>
@@ -8266,6 +8678,7 @@
               <w:rPr>
                 <w:sz w:val="14"/>
               </w:rPr>
+              <w:t>100% model-layer placement</w:t>
             </w:r>
           </w:p>
         </w:tc>
@@ -8283,6 +8696,7 @@
               <w:rPr>
                 <w:sz w:val="14"/>
               </w:rPr>
+              <w:t>experiments/granite_turboquant_intel/logs/upstream-llama-cpp/UL-10/UL-10-R001/bench-stderr.jsonl</w:t>
             </w:r>
           </w:p>
         </w:tc>
@@ -8338,6 +8752,7 @@
               <w:rPr>
                 <w:sz w:val="14"/>
               </w:rPr>
+              <w:t>Vulkan0 plus CPU</w:t>
             </w:r>
           </w:p>
         </w:tc>
@@ -8354,6 +8769,7 @@
               <w:rPr>
                 <w:sz w:val="14"/>
               </w:rPr>
+              <w:t>Vulkan</w:t>
             </w:r>
           </w:p>
         </w:tc>
@@ -8370,6 +8786,7 @@
               <w:rPr>
                 <w:sz w:val="14"/>
               </w:rPr>
+              <w:t>1 of 41 layers</w:t>
             </w:r>
           </w:p>
         </w:tc>
@@ -8386,6 +8803,7 @@
               <w:rPr>
                 <w:sz w:val="14"/>
               </w:rPr>
+              <w:t>N/A upstream</w:t>
             </w:r>
           </w:p>
         </w:tc>
@@ -8402,6 +8820,7 @@
               <w:rPr>
                 <w:sz w:val="14"/>
               </w:rPr>
+              <w:t>Yes, 40 layers</w:t>
             </w:r>
           </w:p>
         </w:tc>
@@ -8418,6 +8837,7 @@
               <w:rPr>
                 <w:sz w:val="14"/>
               </w:rPr>
+              <w:t>97.6% model-layer placement</w:t>
             </w:r>
           </w:p>
         </w:tc>
@@ -8434,6 +8854,7 @@
               <w:rPr>
                 <w:sz w:val="14"/>
               </w:rPr>
+              <w:t>2.4% model-layer placement</w:t>
             </w:r>
           </w:p>
         </w:tc>
@@ -8450,6 +8871,7 @@
               <w:rPr>
                 <w:sz w:val="14"/>
               </w:rPr>
+              <w:t>experiments/granite_turboquant_intel/logs/upstream-llama-cpp/UL-11/UL-11-R001/bench-stderr.jsonl</w:t>
             </w:r>
           </w:p>
         </w:tc>
@@ -8508,6 +8930,7 @@
               <w:rPr>
                 <w:sz w:val="14"/>
               </w:rPr>
+              <w:t>Vulkan0</w:t>
             </w:r>
           </w:p>
         </w:tc>
@@ -8525,6 +8948,7 @@
               <w:rPr>
                 <w:sz w:val="14"/>
               </w:rPr>
+              <w:t>Vulkan</w:t>
             </w:r>
           </w:p>
         </w:tc>
@@ -8542,6 +8966,7 @@
               <w:rPr>
                 <w:sz w:val="14"/>
               </w:rPr>
+              <w:t>All 41 layers</w:t>
             </w:r>
           </w:p>
         </w:tc>
@@ -8559,6 +8984,7 @@
               <w:rPr>
                 <w:sz w:val="14"/>
               </w:rPr>
+              <w:t>N/A upstream</w:t>
             </w:r>
           </w:p>
         </w:tc>
@@ -8576,6 +9002,7 @@
               <w:rPr>
                 <w:sz w:val="14"/>
               </w:rPr>
+              <w:t>No model-layer fallback</w:t>
             </w:r>
           </w:p>
         </w:tc>
@@ -8593,6 +9020,7 @@
               <w:rPr>
                 <w:sz w:val="14"/>
               </w:rPr>
+              <w:t>0% model-layer placement</w:t>
             </w:r>
           </w:p>
         </w:tc>
@@ -8610,6 +9038,7 @@
               <w:rPr>
                 <w:sz w:val="14"/>
               </w:rPr>
+              <w:t>100% model-layer placement</w:t>
             </w:r>
           </w:p>
         </w:tc>
@@ -8627,6 +9056,7 @@
               <w:rPr>
                 <w:sz w:val="14"/>
               </w:rPr>
+              <w:t>experiments/granite_turboquant_intel/logs/upstream-llama-cpp/UL-12/UL-12-R001/bench-stderr.jsonl</w:t>
             </w:r>
           </w:p>
         </w:tc>
@@ -8682,6 +9112,7 @@
               <w:rPr>
                 <w:sz w:val="14"/>
               </w:rPr>
+              <w:t>SYCL0 – Intel UHD Graphics</w:t>
             </w:r>
           </w:p>
         </w:tc>
@@ -8698,6 +9129,7 @@
               <w:rPr>
                 <w:sz w:val="14"/>
               </w:rPr>
+              <w:t>SYCL</w:t>
             </w:r>
           </w:p>
         </w:tc>
@@ -8714,6 +9146,7 @@
               <w:rPr>
                 <w:sz w:val="14"/>
               </w:rPr>
+              <w:t>All reported layers (`-ngl 99`)</w:t>
             </w:r>
           </w:p>
         </w:tc>
@@ -8730,6 +9163,7 @@
               <w:rPr>
                 <w:sz w:val="14"/>
               </w:rPr>
+              <w:t>N/A upstream</w:t>
             </w:r>
           </w:p>
         </w:tc>
@@ -8746,6 +9180,7 @@
               <w:rPr>
                 <w:sz w:val="14"/>
               </w:rPr>
+              <w:t>No model-layer fallback</w:t>
             </w:r>
           </w:p>
         </w:tc>
@@ -8762,6 +9197,7 @@
               <w:rPr>
                 <w:sz w:val="14"/>
               </w:rPr>
+              <w:t>0% model-layer placement</w:t>
             </w:r>
           </w:p>
         </w:tc>
@@ -8778,6 +9214,7 @@
               <w:rPr>
                 <w:sz w:val="14"/>
               </w:rPr>
+              <w:t>100% model-layer placement</w:t>
             </w:r>
           </w:p>
         </w:tc>
@@ -8794,6 +9231,7 @@
               <w:rPr>
                 <w:sz w:val="14"/>
               </w:rPr>
+              <w:t>experiments/granite_turboquant_intel/logs/upstream-llama-cpp/UL-13/UL-13-R002/bench-stdout.jsonl</w:t>
             </w:r>
           </w:p>
         </w:tc>
@@ -9215,6 +9653,7 @@
               <w:rPr>
                 <w:sz w:val="14"/>
               </w:rPr>
+              <w:t>936.00</w:t>
             </w:r>
           </w:p>
         </w:tc>
@@ -9231,6 +9670,7 @@
               <w:rPr>
                 <w:sz w:val="14"/>
               </w:rPr>
+              <w:t>26.0</w:t>
             </w:r>
           </w:p>
         </w:tc>
@@ -9247,6 +9687,7 @@
               <w:rPr>
                 <w:sz w:val="14"/>
               </w:rPr>
+              <w:t>602.99</w:t>
             </w:r>
           </w:p>
         </w:tc>
@@ -9263,6 +9704,7 @@
               <w:rPr>
                 <w:sz w:val="14"/>
               </w:rPr>
+              <w:t>37.191 decode; 96.324 prompt</w:t>
             </w:r>
           </w:p>
         </w:tc>
@@ -9279,6 +9721,7 @@
               <w:rPr>
                 <w:sz w:val="14"/>
               </w:rPr>
+              <w:t>4.0</w:t>
             </w:r>
           </w:p>
         </w:tc>
@@ -9295,6 +9738,7 @@
               <w:rPr>
                 <w:sz w:val="14"/>
               </w:rPr>
+              <w:t>Passed</w:t>
             </w:r>
           </w:p>
         </w:tc>
@@ -9311,6 +9755,7 @@
               <w:rPr>
                 <w:sz w:val="14"/>
               </w:rPr>
+              <w:t>Q4 diagnostic runtime; all P1-P4 outputs hit objective caps.</w:t>
             </w:r>
           </w:p>
         </w:tc>
@@ -9459,6 +9904,7 @@
               <w:rPr>
                 <w:sz w:val="14"/>
               </w:rPr>
+              <w:t>6,712.36</w:t>
             </w:r>
           </w:p>
         </w:tc>
@@ -9476,6 +9922,7 @@
               <w:rPr>
                 <w:sz w:val="14"/>
               </w:rPr>
+              <w:t>160.0</w:t>
             </w:r>
           </w:p>
         </w:tc>
@@ -9493,6 +9940,7 @@
               <w:rPr>
                 <w:sz w:val="14"/>
               </w:rPr>
+              <w:t>1,430.20</w:t>
             </w:r>
           </w:p>
         </w:tc>
@@ -9510,6 +9958,7 @@
               <w:rPr>
                 <w:sz w:val="14"/>
               </w:rPr>
+              <w:t>6.353 decode; 28.676 prompt</w:t>
             </w:r>
           </w:p>
         </w:tc>
@@ -9527,6 +9976,7 @@
               <w:rPr>
                 <w:sz w:val="14"/>
               </w:rPr>
+              <w:t>8.9</w:t>
             </w:r>
           </w:p>
         </w:tc>
@@ -9544,6 +9994,7 @@
               <w:rPr>
                 <w:sz w:val="14"/>
               </w:rPr>
+              <w:t>Passed</w:t>
             </w:r>
           </w:p>
         </w:tc>
@@ -9561,6 +10012,7 @@
               <w:rPr>
                 <w:sz w:val="14"/>
               </w:rPr>
+              <w:t>Highest-quality reference but slow and large.</w:t>
             </w:r>
           </w:p>
         </w:tc>
@@ -9701,6 +10153,7 @@
               <w:rPr>
                 <w:sz w:val="14"/>
               </w:rPr>
+              <w:t>3,829.81</w:t>
             </w:r>
           </w:p>
         </w:tc>
@@ -9717,6 +10170,7 @@
               <w:rPr>
                 <w:sz w:val="14"/>
               </w:rPr>
+              <w:t>320.0</w:t>
             </w:r>
           </w:p>
         </w:tc>
@@ -9733,6 +10187,7 @@
               <w:rPr>
                 <w:sz w:val="14"/>
               </w:rPr>
+              <w:t>2,394.29</w:t>
             </w:r>
           </w:p>
         </w:tc>
@@ -9749,6 +10204,7 @@
               <w:rPr>
                 <w:sz w:val="14"/>
               </w:rPr>
+              <w:t>11.393 decode; 20.643 prompt</w:t>
             </w:r>
           </w:p>
         </w:tc>
@@ -9765,6 +10221,7 @@
               <w:rPr>
                 <w:sz w:val="14"/>
               </w:rPr>
+              <w:t>8.9</w:t>
             </w:r>
           </w:p>
         </w:tc>
@@ -9781,6 +10238,7 @@
               <w:rPr>
                 <w:sz w:val="14"/>
               </w:rPr>
+              <w:t>Passed</w:t>
             </w:r>
           </w:p>
         </w:tc>
@@ -9797,6 +10255,7 @@
               <w:rPr>
                 <w:sz w:val="14"/>
               </w:rPr>
+              <w:t>Best measured quality/size compromise.</w:t>
             </w:r>
           </w:p>
         </w:tc>
@@ -9945,6 +10404,7 @@
               <w:rPr>
                 <w:sz w:val="14"/>
               </w:rPr>
+              <w:t>3,828.79</w:t>
             </w:r>
           </w:p>
         </w:tc>
@@ -9962,6 +10422,7 @@
               <w:rPr>
                 <w:sz w:val="14"/>
               </w:rPr>
+              <w:t>320.0</w:t>
             </w:r>
           </w:p>
         </w:tc>
@@ -9979,6 +10440,7 @@
               <w:rPr>
                 <w:sz w:val="14"/>
               </w:rPr>
+              <w:t>945.70</w:t>
             </w:r>
           </w:p>
         </w:tc>
@@ -9996,6 +10458,7 @@
               <w:rPr>
                 <w:sz w:val="14"/>
               </w:rPr>
+              <w:t>15.979 decode; 33.993 prompt</w:t>
             </w:r>
           </w:p>
         </w:tc>
@@ -10013,6 +10476,7 @@
               <w:rPr>
                 <w:sz w:val="14"/>
               </w:rPr>
+              <w:t>7.1</w:t>
             </w:r>
           </w:p>
         </w:tc>
@@ -10030,6 +10494,7 @@
               <w:rPr>
                 <w:sz w:val="14"/>
               </w:rPr>
+              <w:t>Passed</w:t>
             </w:r>
           </w:p>
         </w:tc>
@@ -10047,6 +10512,7 @@
               <w:rPr>
                 <w:sz w:val="14"/>
               </w:rPr>
+              <w:t>Fastest measured CPU 3B configuration.</w:t>
             </w:r>
           </w:p>
         </w:tc>
@@ -10187,6 +10653,7 @@
               <w:rPr>
                 <w:sz w:val="14"/>
               </w:rPr>
+              <w:t>3,678.64</w:t>
             </w:r>
           </w:p>
         </w:tc>
@@ -10203,6 +10670,7 @@
               <w:rPr>
                 <w:sz w:val="14"/>
               </w:rPr>
+              <w:t>170.0</w:t>
             </w:r>
           </w:p>
         </w:tc>
@@ -10219,6 +10687,7 @@
               <w:rPr>
                 <w:sz w:val="14"/>
               </w:rPr>
+              <w:t>939.58</w:t>
             </w:r>
           </w:p>
         </w:tc>
@@ -10235,6 +10704,7 @@
               <w:rPr>
                 <w:sz w:val="14"/>
               </w:rPr>
+              <w:t>15.771 decode; 15.181 prompt</w:t>
             </w:r>
           </w:p>
         </w:tc>
@@ -10251,6 +10721,7 @@
               <w:rPr>
                 <w:sz w:val="14"/>
               </w:rPr>
+              <w:t>5.9 P1-P6</w:t>
             </w:r>
           </w:p>
         </w:tc>
@@ -10267,6 +10738,7 @@
               <w:rPr>
                 <w:sz w:val="14"/>
               </w:rPr>
+              <w:t>Passed with quality caveats</w:t>
             </w:r>
           </w:p>
         </w:tc>
@@ -10283,6 +10755,7 @@
               <w:rPr>
                 <w:sz w:val="14"/>
               </w:rPr>
+              <w:t>KV Q8 reduces allocated KV by 150 MB but hurts prefill; P5/P6 exactness is weak.</w:t>
             </w:r>
           </w:p>
         </w:tc>
@@ -10431,6 +10904,7 @@
               <w:rPr>
                 <w:sz w:val="14"/>
               </w:rPr>
+              <w:t>8,879.95</w:t>
             </w:r>
           </w:p>
         </w:tc>
@@ -10448,6 +10922,7 @@
               <w:rPr>
                 <w:sz w:val="14"/>
               </w:rPr>
+              <w:t>320.0</w:t>
             </w:r>
           </w:p>
         </w:tc>
@@ -10465,6 +10940,7 @@
               <w:rPr>
                 <w:sz w:val="14"/>
               </w:rPr>
+              <w:t>7,246.13</w:t>
             </w:r>
           </w:p>
         </w:tc>
@@ -10482,6 +10958,7 @@
               <w:rPr>
                 <w:sz w:val="14"/>
               </w:rPr>
+              <w:t>4.703 decode; 9.806 prompt</w:t>
             </w:r>
           </w:p>
         </w:tc>
@@ -10499,6 +10976,7 @@
               <w:rPr>
                 <w:sz w:val="14"/>
               </w:rPr>
+              <w:t>6.6</w:t>
             </w:r>
           </w:p>
         </w:tc>
@@ -10516,6 +10994,7 @@
               <w:rPr>
                 <w:sz w:val="14"/>
               </w:rPr>
+              <w:t>Passed</w:t>
             </w:r>
           </w:p>
         </w:tc>
@@ -10533,6 +11012,7 @@
               <w:rPr>
                 <w:sz w:val="14"/>
               </w:rPr>
+              <w:t>Fits, but slower and not better on this rubric.</w:t>
             </w:r>
           </w:p>
         </w:tc>
@@ -10673,6 +11153,7 @@
               <w:rPr>
                 <w:sz w:val="14"/>
               </w:rPr>
+              <w:t>9,251.02</w:t>
             </w:r>
           </w:p>
         </w:tc>
@@ -10689,6 +11170,7 @@
               <w:rPr>
                 <w:sz w:val="14"/>
               </w:rPr>
+              <w:t>640.0</w:t>
             </w:r>
           </w:p>
         </w:tc>
@@ -10705,6 +11187,7 @@
               <w:rPr>
                 <w:sz w:val="14"/>
               </w:rPr>
+              <w:t>3,172.40</w:t>
             </w:r>
           </w:p>
         </w:tc>
@@ -10721,6 +11204,7 @@
               <w:rPr>
                 <w:sz w:val="14"/>
               </w:rPr>
+              <w:t>7.087 decode; 16.189 prompt</w:t>
             </w:r>
           </w:p>
         </w:tc>
@@ -10737,6 +11221,7 @@
               <w:rPr>
                 <w:sz w:val="14"/>
               </w:rPr>
+              <w:t>6.5</w:t>
             </w:r>
           </w:p>
         </w:tc>
@@ -10753,6 +11238,7 @@
               <w:rPr>
                 <w:sz w:val="14"/>
               </w:rPr>
+              <w:t>Passed with quality caveat</w:t>
             </w:r>
           </w:p>
         </w:tc>
@@ -10769,6 +11255,7 @@
               <w:rPr>
                 <w:sz w:val="14"/>
               </w:rPr>
+              <w:t>Best measured 8B CPU throughput; P4 omission capped.</w:t>
             </w:r>
           </w:p>
         </w:tc>
@@ -10917,6 +11404,7 @@
               <w:rPr>
                 <w:sz w:val="14"/>
               </w:rPr>
+              <w:t>8,950.21</w:t>
             </w:r>
           </w:p>
         </w:tc>
@@ -10934,6 +11422,7 @@
               <w:rPr>
                 <w:sz w:val="14"/>
               </w:rPr>
+              <w:t>340.0</w:t>
             </w:r>
           </w:p>
         </w:tc>
@@ -10951,6 +11440,7 @@
               <w:rPr>
                 <w:sz w:val="14"/>
               </w:rPr>
+              <w:t>2,978.72</w:t>
             </w:r>
           </w:p>
         </w:tc>
@@ -10968,6 +11458,7 @@
               <w:rPr>
                 <w:sz w:val="14"/>
               </w:rPr>
+              <w:t>7.092 decode; 9.294 prompt</w:t>
             </w:r>
           </w:p>
         </w:tc>
@@ -10985,6 +11476,7 @@
               <w:rPr>
                 <w:sz w:val="14"/>
               </w:rPr>
+              <w:t>6.9</w:t>
             </w:r>
           </w:p>
         </w:tc>
@@ -11002,6 +11494,7 @@
               <w:rPr>
                 <w:sz w:val="14"/>
               </w:rPr>
+              <w:t>Passed with quality caveats</w:t>
             </w:r>
           </w:p>
         </w:tc>
@@ -11019,6 +11512,7 @@
               <w:rPr>
                 <w:sz w:val="14"/>
               </w:rPr>
+              <w:t>Q8 KV saves 300 MB allocation but hurts prefill without material decode gain.</w:t>
             </w:r>
           </w:p>
         </w:tc>
@@ -11159,6 +11653,7 @@
               <w:rPr>
                 <w:sz w:val="14"/>
               </w:rPr>
+              <w:t>2,558.20</w:t>
             </w:r>
           </w:p>
         </w:tc>
@@ -11175,6 +11670,7 @@
               <w:rPr>
                 <w:sz w:val="14"/>
               </w:rPr>
+              <w:t>170.0</w:t>
             </w:r>
           </w:p>
         </w:tc>
@@ -11191,6 +11687,7 @@
               <w:rPr>
                 <w:sz w:val="14"/>
               </w:rPr>
+              <w:t>1,677.30</w:t>
             </w:r>
           </w:p>
         </w:tc>
@@ -11207,6 +11704,7 @@
               <w:rPr>
                 <w:sz w:val="14"/>
               </w:rPr>
+              <w:t>15.214 decode; 79.856 prompt</w:t>
             </w:r>
           </w:p>
         </w:tc>
@@ -11223,6 +11721,7 @@
               <w:rPr>
                 <w:sz w:val="14"/>
               </w:rPr>
+              <w:t>7.3</w:t>
             </w:r>
           </w:p>
         </w:tc>
@@ -11239,6 +11738,7 @@
               <w:rPr>
                 <w:sz w:val="14"/>
               </w:rPr>
+              <w:t>Passed</w:t>
             </w:r>
           </w:p>
         </w:tc>
@@ -11255,6 +11755,7 @@
               <w:rPr>
                 <w:sz w:val="14"/>
               </w:rPr>
+              <w:t>Best interactive GPU route: large prefill gain, near-CPU decode.</w:t>
             </w:r>
           </w:p>
         </w:tc>
@@ -11403,6 +11904,7 @@
               <w:rPr>
                 <w:sz w:val="14"/>
               </w:rPr>
+              <w:t>4,345.35</w:t>
             </w:r>
           </w:p>
         </w:tc>
@@ -11420,6 +11922,7 @@
               <w:rPr>
                 <w:sz w:val="14"/>
               </w:rPr>
+              <w:t>170.0</w:t>
             </w:r>
           </w:p>
         </w:tc>
@@ -11437,6 +11940,7 @@
               <w:rPr>
                 <w:sz w:val="14"/>
               </w:rPr>
+              <w:t>1,044.02</w:t>
             </w:r>
           </w:p>
         </w:tc>
@@ -11454,6 +11958,7 @@
               <w:rPr>
                 <w:sz w:val="14"/>
               </w:rPr>
+              <w:t>9.632 decode; 84.497 prompt</w:t>
             </w:r>
           </w:p>
         </w:tc>
@@ -11471,6 +11976,7 @@
               <w:rPr>
                 <w:sz w:val="14"/>
               </w:rPr>
+              <w:t>7.3</w:t>
             </w:r>
           </w:p>
         </w:tc>
@@ -11488,6 +11994,7 @@
               <w:rPr>
                 <w:sz w:val="14"/>
               </w:rPr>
+              <w:t>Passed with performance regression</w:t>
             </w:r>
           </w:p>
         </w:tc>
@@ -11505,6 +12012,7 @@
               <w:rPr>
                 <w:sz w:val="14"/>
               </w:rPr>
+              <w:t>Full offload slightly improves prefill but sharply reduces decode.</w:t>
             </w:r>
           </w:p>
         </w:tc>
@@ -11645,6 +12153,7 @@
               <w:rPr>
                 <w:sz w:val="14"/>
               </w:rPr>
+              <w:t>5,773.38</w:t>
             </w:r>
           </w:p>
         </w:tc>
@@ -11661,6 +12170,7 @@
               <w:rPr>
                 <w:sz w:val="14"/>
               </w:rPr>
+              <w:t>340.0</w:t>
             </w:r>
           </w:p>
         </w:tc>
@@ -11677,6 +12187,7 @@
               <w:rPr>
                 <w:sz w:val="14"/>
               </w:rPr>
+              <w:t>3,339.78</w:t>
             </w:r>
           </w:p>
         </w:tc>
@@ -11693,6 +12204,7 @@
               <w:rPr>
                 <w:sz w:val="14"/>
               </w:rPr>
+              <w:t>6.219 decode; 31.794 prompt</w:t>
             </w:r>
           </w:p>
         </w:tc>
@@ -11709,6 +12221,7 @@
               <w:rPr>
                 <w:sz w:val="14"/>
               </w:rPr>
+              <w:t>6.8</w:t>
             </w:r>
           </w:p>
         </w:tc>
@@ -11725,6 +12238,7 @@
               <w:rPr>
                 <w:sz w:val="14"/>
               </w:rPr>
+              <w:t>Passed</w:t>
             </w:r>
           </w:p>
         </w:tc>
@@ -11741,6 +12255,7 @@
               <w:rPr>
                 <w:sz w:val="14"/>
               </w:rPr>
+              <w:t>Useful prefill gain; moderate decode loss.</w:t>
             </w:r>
           </w:p>
         </w:tc>
@@ -11889,6 +12404,7 @@
               <w:rPr>
                 <w:sz w:val="14"/>
               </w:rPr>
+              <w:t>10,308.56</w:t>
             </w:r>
           </w:p>
         </w:tc>
@@ -11906,6 +12422,7 @@
               <w:rPr>
                 <w:sz w:val="14"/>
               </w:rPr>
+              <w:t>340.0</w:t>
             </w:r>
           </w:p>
         </w:tc>
@@ -11923,6 +12440,7 @@
               <w:rPr>
                 <w:sz w:val="14"/>
               </w:rPr>
+              <w:t>2,492.26</w:t>
             </w:r>
           </w:p>
         </w:tc>
@@ -11940,6 +12458,7 @@
               <w:rPr>
                 <w:sz w:val="14"/>
               </w:rPr>
+              <w:t>4.385 decode; 33.785 prompt</w:t>
             </w:r>
           </w:p>
         </w:tc>
@@ -11957,6 +12476,7 @@
               <w:rPr>
                 <w:sz w:val="14"/>
               </w:rPr>
+              <w:t>6.8</w:t>
             </w:r>
           </w:p>
         </w:tc>
@@ -11974,6 +12494,7 @@
               <w:rPr>
                 <w:sz w:val="14"/>
               </w:rPr>
+              <w:t>Passed with performance regression</w:t>
             </w:r>
           </w:p>
         </w:tc>
@@ -11991,6 +12512,7 @@
               <w:rPr>
                 <w:sz w:val="14"/>
               </w:rPr>
+              <w:t>Full offload is worse for interactive decode and uses the most measured RAM.</w:t>
             </w:r>
           </w:p>
         </w:tc>
@@ -12097,7 +12619,7 @@
               <w:rPr>
                 <w:sz w:val="14"/>
               </w:rPr>
-              <w:t>SYCL0, all 41 layers</w:t>
+              <w:t>SYCL0, all reported layers</w:t>
             </w:r>
           </w:p>
         </w:tc>
@@ -12131,6 +12653,7 @@
               <w:rPr>
                 <w:sz w:val="14"/>
               </w:rPr>
+              <w:t>5,274.96</w:t>
             </w:r>
           </w:p>
         </w:tc>
@@ -12147,6 +12670,7 @@
               <w:rPr>
                 <w:sz w:val="14"/>
               </w:rPr>
+              <w:t>170.0</w:t>
             </w:r>
           </w:p>
         </w:tc>
@@ -12163,6 +12687,7 @@
               <w:rPr>
                 <w:sz w:val="14"/>
               </w:rPr>
+              <w:t>2,314.26</w:t>
             </w:r>
           </w:p>
         </w:tc>
@@ -12179,6 +12704,7 @@
               <w:rPr>
                 <w:sz w:val="14"/>
               </w:rPr>
+              <w:t>7.211 decode; 40.789 prompt</w:t>
             </w:r>
           </w:p>
         </w:tc>
@@ -12195,6 +12721,7 @@
               <w:rPr>
                 <w:sz w:val="14"/>
               </w:rPr>
+              <w:t>6.8</w:t>
             </w:r>
           </w:p>
         </w:tc>
@@ -12211,6 +12738,7 @@
               <w:rPr>
                 <w:sz w:val="14"/>
               </w:rPr>
+              <w:t>Passed with edge-suite limitation</w:t>
             </w:r>
           </w:p>
         </w:tc>
@@ -12227,6 +12755,7 @@
               <w:rPr>
                 <w:sz w:val="14"/>
               </w:rPr>
+              <w:t>Formal project inference passes; the broad SYCL suite remains 49/52.</w:t>
             </w:r>
           </w:p>
         </w:tc>
@@ -12463,6 +12992,7 @@
               <w:rPr>
                 <w:sz w:val="14"/>
               </w:rPr>
+              <w:t>9.5, UL-02 BF16</w:t>
             </w:r>
           </w:p>
         </w:tc>
@@ -12479,6 +13009,7 @@
               <w:rPr>
                 <w:sz w:val="14"/>
               </w:rPr>
+              <w:t>4.0, UL-09</w:t>
             </w:r>
           </w:p>
         </w:tc>
@@ -12495,6 +13026,7 @@
               <w:rPr>
                 <w:sz w:val="14"/>
               </w:rPr>
+              <w:t>No; required-term/slot cap</w:t>
             </w:r>
           </w:p>
         </w:tc>
@@ -12511,6 +13043,7 @@
               <w:rPr>
                 <w:sz w:val="14"/>
               </w:rPr>
+              <w:t>Partly</w:t>
             </w:r>
           </w:p>
         </w:tc>
@@ -12527,6 +13060,7 @@
               <w:rPr>
                 <w:sz w:val="14"/>
               </w:rPr>
+              <w:t>No</w:t>
             </w:r>
           </w:p>
         </w:tc>
@@ -12543,6 +13077,7 @@
               <w:rPr>
                 <w:sz w:val="14"/>
               </w:rPr>
+              <w:t>Fluent output is not enough: optimised answer misses exact rubric constraints.</w:t>
             </w:r>
           </w:p>
         </w:tc>
@@ -12601,6 +13136,7 @@
               <w:rPr>
                 <w:sz w:val="14"/>
               </w:rPr>
+              <w:t>9.0, UL-02 BF16</w:t>
             </w:r>
           </w:p>
         </w:tc>
@@ -12618,6 +13154,7 @@
               <w:rPr>
                 <w:sz w:val="14"/>
               </w:rPr>
+              <w:t>8.5, UL-09</w:t>
             </w:r>
           </w:p>
         </w:tc>
@@ -12635,6 +13172,7 @@
               <w:rPr>
                 <w:sz w:val="14"/>
               </w:rPr>
+              <w:t>Yes</w:t>
             </w:r>
           </w:p>
         </w:tc>
@@ -12652,6 +13190,7 @@
               <w:rPr>
                 <w:sz w:val="14"/>
               </w:rPr>
+              <w:t>Mostly</w:t>
             </w:r>
           </w:p>
         </w:tc>
@@ -12669,6 +13208,7 @@
               <w:rPr>
                 <w:sz w:val="14"/>
               </w:rPr>
+              <w:t>No</w:t>
             </w:r>
           </w:p>
         </w:tc>
@@ -12686,6 +13226,7 @@
               <w:rPr>
                 <w:sz w:val="14"/>
               </w:rPr>
+              <w:t>Optimised answer is useful but slightly generic.</w:t>
             </w:r>
           </w:p>
         </w:tc>
@@ -12741,6 +13282,7 @@
               <w:rPr>
                 <w:sz w:val="14"/>
               </w:rPr>
+              <w:t>7.0, UL-02 BF16</w:t>
             </w:r>
           </w:p>
         </w:tc>
@@ -12757,6 +13299,7 @@
               <w:rPr>
                 <w:sz w:val="14"/>
               </w:rPr>
+              <w:t>6.5, UL-09</w:t>
             </w:r>
           </w:p>
         </w:tc>
@@ -12773,6 +13316,7 @@
               <w:rPr>
                 <w:sz w:val="14"/>
               </w:rPr>
+              <w:t>Yes</w:t>
             </w:r>
           </w:p>
         </w:tc>
@@ -12789,6 +13333,7 @@
               <w:rPr>
                 <w:sz w:val="14"/>
               </w:rPr>
+              <w:t>Partly</w:t>
             </w:r>
           </w:p>
         </w:tc>
@@ -12805,6 +13350,7 @@
               <w:rPr>
                 <w:sz w:val="14"/>
               </w:rPr>
+              <w:t>No</w:t>
             </w:r>
           </w:p>
         </w:tc>
@@ -12821,6 +13367,7 @@
               <w:rPr>
                 <w:sz w:val="14"/>
               </w:rPr>
+              <w:t>JSON parses, but unsupported labels reduce grounding score.</w:t>
             </w:r>
           </w:p>
         </w:tc>
@@ -12879,6 +13426,7 @@
               <w:rPr>
                 <w:sz w:val="14"/>
               </w:rPr>
+              <w:t>10.0, UL-02 BF16</w:t>
             </w:r>
           </w:p>
         </w:tc>
@@ -12896,6 +13444,7 @@
               <w:rPr>
                 <w:sz w:val="14"/>
               </w:rPr>
+              <w:t>10.0, UL-09</w:t>
             </w:r>
           </w:p>
         </w:tc>
@@ -12913,6 +13462,7 @@
               <w:rPr>
                 <w:sz w:val="14"/>
               </w:rPr>
+              <w:t>Yes</w:t>
             </w:r>
           </w:p>
         </w:tc>
@@ -12930,6 +13480,7 @@
               <w:rPr>
                 <w:sz w:val="14"/>
               </w:rPr>
+              <w:t>Yes</w:t>
             </w:r>
           </w:p>
         </w:tc>
@@ -12947,6 +13498,7 @@
               <w:rPr>
                 <w:sz w:val="14"/>
               </w:rPr>
+              <w:t>No</w:t>
             </w:r>
           </w:p>
         </w:tc>
@@ -12964,6 +13516,7 @@
               <w:rPr>
                 <w:sz w:val="14"/>
               </w:rPr>
+              <w:t>Required facts retained without corruption.</w:t>
             </w:r>
           </w:p>
         </w:tc>
@@ -13019,6 +13572,7 @@
               <w:rPr>
                 <w:sz w:val="14"/>
               </w:rPr>
+              <w:t>Not run on BF16</w:t>
             </w:r>
           </w:p>
         </w:tc>
@@ -13035,6 +13589,7 @@
               <w:rPr>
                 <w:sz w:val="14"/>
               </w:rPr>
+              <w:t>4.0, UL-05</w:t>
             </w:r>
           </w:p>
         </w:tc>
@@ -13051,6 +13606,7 @@
               <w:rPr>
                 <w:sz w:val="14"/>
               </w:rPr>
+              <w:t>No; missing `MARKER:` prefix</w:t>
             </w:r>
           </w:p>
         </w:tc>
@@ -13067,6 +13623,7 @@
               <w:rPr>
                 <w:sz w:val="14"/>
               </w:rPr>
+              <w:t>Value retained; prefix omitted</w:t>
             </w:r>
           </w:p>
         </w:tc>
@@ -13083,6 +13640,7 @@
               <w:rPr>
                 <w:sz w:val="14"/>
               </w:rPr>
+              <w:t>No</w:t>
             </w:r>
           </w:p>
         </w:tc>
@@ -13099,6 +13657,7 @@
               <w:rPr>
                 <w:sz w:val="14"/>
               </w:rPr>
+              <w:t>16,384 context required; exact-format cap applied.</w:t>
             </w:r>
           </w:p>
         </w:tc>
@@ -13157,6 +13716,7 @@
               <w:rPr>
                 <w:sz w:val="14"/>
               </w:rPr>
+              <w:t>Not run on BF16</w:t>
             </w:r>
           </w:p>
         </w:tc>
@@ -13174,6 +13734,7 @@
               <w:rPr>
                 <w:sz w:val="14"/>
               </w:rPr>
+              <w:t>2.0, UL-05</w:t>
             </w:r>
           </w:p>
         </w:tc>
@@ -13191,6 +13752,7 @@
               <w:rPr>
                 <w:sz w:val="14"/>
               </w:rPr>
+              <w:t>No; exact value not retained</w:t>
             </w:r>
           </w:p>
         </w:tc>
@@ -13208,6 +13770,7 @@
               <w:rPr>
                 <w:sz w:val="14"/>
               </w:rPr>
+              <w:t>Partly</w:t>
             </w:r>
           </w:p>
         </w:tc>
@@ -13225,6 +13788,7 @@
               <w:rPr>
                 <w:sz w:val="14"/>
               </w:rPr>
+              <w:t>No</w:t>
             </w:r>
           </w:p>
         </w:tc>
@@ -13242,6 +13806,7 @@
               <w:rPr>
                 <w:sz w:val="14"/>
               </w:rPr>
+              <w:t>Turn 2 returned `4821`, not exact `amber:4821`.</w:t>
             </w:r>
           </w:p>
         </w:tc>
@@ -13436,6 +14001,7 @@
               <w:rPr>
                 <w:sz w:val="14"/>
               </w:rPr>
+              <w:t>UL-F01</w:t>
             </w:r>
           </w:p>
         </w:tc>
@@ -13452,6 +14018,7 @@
               <w:rPr>
                 <w:sz w:val="14"/>
               </w:rPr>
+              <w:t>UL-B05</w:t>
             </w:r>
           </w:p>
         </w:tc>
@@ -13468,6 +14035,7 @@
               <w:rPr>
                 <w:sz w:val="14"/>
               </w:rPr>
+              <w:t>REPRO</w:t>
             </w:r>
           </w:p>
         </w:tc>
@@ -13484,6 +14052,7 @@
               <w:rPr>
                 <w:sz w:val="14"/>
               </w:rPr>
+              <w:t>R001 cache validator reported failure although required keys existed.</w:t>
             </w:r>
           </w:p>
         </w:tc>
@@ -13500,6 +14069,7 @@
               <w:rPr>
                 <w:sz w:val="14"/>
               </w:rPr>
+              <w:t>End-of-line regex rejected CRLF.</w:t>
             </w:r>
           </w:p>
         </w:tc>
@@ -13516,6 +14086,7 @@
               <w:rPr>
                 <w:sz w:val="14"/>
               </w:rPr>
+              <w:t>Correct validator and rerun.</w:t>
             </w:r>
           </w:p>
         </w:tc>
@@ -13532,6 +14103,7 @@
               <w:rPr>
                 <w:sz w:val="14"/>
               </w:rPr>
+              <w:t>Yes, R002/R003</w:t>
             </w:r>
           </w:p>
         </w:tc>
@@ -13548,6 +14120,7 @@
               <w:rPr>
                 <w:sz w:val="14"/>
               </w:rPr>
+              <w:t>experiments/granite_turboquant_intel/notes/upstream-llama-cpp/UL-B05/UL-B05-R002/R001-cache-validation-failure-analysis.md</w:t>
             </w:r>
           </w:p>
         </w:tc>
@@ -13570,6 +14143,7 @@
               <w:rPr>
                 <w:sz w:val="14"/>
               </w:rPr>
+              <w:t>UL-F02</w:t>
             </w:r>
           </w:p>
         </w:tc>
@@ -13587,6 +14161,7 @@
               <w:rPr>
                 <w:sz w:val="14"/>
               </w:rPr>
+              <w:t>UL-B05</w:t>
             </w:r>
           </w:p>
         </w:tc>
@@ -13604,6 +14179,7 @@
               <w:rPr>
                 <w:sz w:val="14"/>
               </w:rPr>
+              <w:t>DEP</w:t>
             </w:r>
           </w:p>
         </w:tc>
@@ -13621,6 +14197,7 @@
               <w:rPr>
                 <w:sz w:val="14"/>
               </w:rPr>
+              <w:t>Vulkan repository suite initially passed 51/52.</w:t>
             </w:r>
           </w:p>
         </w:tc>
@@ -13638,6 +14215,7 @@
               <w:rPr>
                 <w:sz w:val="14"/>
               </w:rPr>
+              <w:t>Jinja2 was absent from test PATH.</w:t>
             </w:r>
           </w:p>
         </w:tc>
@@ -13655,6 +14233,7 @@
               <w:rPr>
                 <w:sz w:val="14"/>
               </w:rPr>
+              <w:t>Add isolated workbook venv to PATH and rerun.</w:t>
             </w:r>
           </w:p>
         </w:tc>
@@ -13672,6 +14251,7 @@
               <w:rPr>
                 <w:sz w:val="14"/>
               </w:rPr>
+              <w:t>Yes, 52/52</w:t>
             </w:r>
           </w:p>
         </w:tc>
@@ -13689,6 +14269,7 @@
               <w:rPr>
                 <w:sz w:val="14"/>
               </w:rPr>
+              <w:t>experiments/granite_turboquant_intel/notes/upstream-llama-cpp/UL-B05/UL-B05-R002/repository-test-failure-analysis.md</w:t>
             </w:r>
           </w:p>
         </w:tc>
@@ -13710,6 +14291,7 @@
               <w:rPr>
                 <w:sz w:val="14"/>
               </w:rPr>
+              <w:t>UL-F03</w:t>
             </w:r>
           </w:p>
         </w:tc>
@@ -13726,6 +14308,7 @@
               <w:rPr>
                 <w:sz w:val="14"/>
               </w:rPr>
+              <w:t>UL-B06/UL-13</w:t>
             </w:r>
           </w:p>
         </w:tc>
@@ -13742,6 +14325,7 @@
               <w:rPr>
                 <w:sz w:val="14"/>
               </w:rPr>
+              <w:t>GPU</w:t>
             </w:r>
           </w:p>
         </w:tc>
@@ -13758,6 +14342,7 @@
               <w:rPr>
                 <w:sz w:val="14"/>
               </w:rPr>
+              <w:t>SYCL broad suite passed 49/52; FP64 unsupported, device lost, and two 0xc0000409 crashes.</w:t>
             </w:r>
           </w:p>
         </w:tc>
@@ -13774,6 +14359,7 @@
               <w:rPr>
                 <w:sz w:val="14"/>
               </w:rPr>
+              <w:t>Edge operations exceed or destabilise current Intel UHD capabilities; they do not reproduce in the Granite Q4 workload.</w:t>
             </w:r>
           </w:p>
         </w:tc>
@@ -13790,6 +14376,7 @@
               <w:rPr>
                 <w:sz w:val="14"/>
               </w:rPr>
+              <w:t>Keep the edge-suite limitation visible; project workload may pass independently.</w:t>
             </w:r>
           </w:p>
         </w:tc>
@@ -13806,6 +14393,7 @@
               <w:rPr>
                 <w:sz w:val="14"/>
               </w:rPr>
+              <w:t>Project workload resolved; edge tests unresolved</w:t>
             </w:r>
           </w:p>
         </w:tc>
@@ -13822,6 +14410,7 @@
               <w:rPr>
                 <w:sz w:val="14"/>
               </w:rPr>
+              <w:t>experiments/granite_turboquant_intel/notes/upstream-llama-cpp/UL-B06/UL-B06-R002/repository-test-failure-analysis.md</w:t>
             </w:r>
           </w:p>
         </w:tc>
@@ -13844,6 +14433,7 @@
               <w:rPr>
                 <w:sz w:val="14"/>
               </w:rPr>
+              <w:t>UL-F04</w:t>
             </w:r>
           </w:p>
         </w:tc>
@@ -13861,6 +14451,7 @@
               <w:rPr>
                 <w:sz w:val="14"/>
               </w:rPr>
+              <w:t>UL-05/P5</w:t>
             </w:r>
           </w:p>
         </w:tc>
@@ -13878,6 +14469,7 @@
               <w:rPr>
                 <w:sz w:val="14"/>
               </w:rPr>
+              <w:t>QUAL</w:t>
             </w:r>
           </w:p>
         </w:tc>
@@ -13895,6 +14487,7 @@
               <w:rPr>
                 <w:sz w:val="14"/>
               </w:rPr>
+              <w:t>Long-context output omitted required literal prefix.</w:t>
             </w:r>
           </w:p>
         </w:tc>
@@ -13912,6 +14505,7 @@
               <w:rPr>
                 <w:sz w:val="14"/>
               </w:rPr>
+              <w:t>Model followed semantic retrieval but not exact output contract.</w:t>
             </w:r>
           </w:p>
         </w:tc>
@@ -13929,6 +14523,7 @@
               <w:rPr>
                 <w:sz w:val="14"/>
               </w:rPr>
+              <w:t>Retain 4-point cap; use constrained validation for app integration.</w:t>
             </w:r>
           </w:p>
         </w:tc>
@@ -13946,6 +14541,7 @@
               <w:rPr>
                 <w:sz w:val="14"/>
               </w:rPr>
+              <w:t>No</w:t>
             </w:r>
           </w:p>
         </w:tc>
@@ -13963,6 +14559,438 @@
               <w:rPr>
                 <w:sz w:val="14"/>
               </w:rPr>
+              <w:t>experiments/granite_turboquant_intel/logs/upstream-llama-cpp/UL-05/UL-05-P5-R004/stdout.txt</w:t>
+            </w:r>
+          </w:p>
+        </w:tc>
+      </w:tr>
+      <w:tr>
+        <w:trPr>
+          <w:cantSplit/>
+        </w:trPr>
+        <w:tc>
+          <w:tcPr>
+            <w:tcW w:type="dxa" w:w="1818"/>
+            <w:vAlign w:val="center"/>
+          </w:tcPr>
+          <w:p>
+            <w:pPr>
+              <w:spacing w:after="0"/>
+            </w:pPr>
+            <w:r>
+              <w:rPr>
+                <w:sz w:val="14"/>
+              </w:rPr>
+              <w:t>UL-F05</w:t>
+            </w:r>
+          </w:p>
+        </w:tc>
+        <w:tc>
+          <w:tcPr>
+            <w:tcW w:type="dxa" w:w="1818"/>
+            <w:vAlign w:val="center"/>
+          </w:tcPr>
+          <w:p>
+            <w:pPr>
+              <w:spacing w:after="0"/>
+            </w:pPr>
+            <w:r>
+              <w:rPr>
+                <w:sz w:val="14"/>
+              </w:rPr>
+              <w:t>UL-05/P6</w:t>
+            </w:r>
+          </w:p>
+        </w:tc>
+        <w:tc>
+          <w:tcPr>
+            <w:tcW w:type="dxa" w:w="1818"/>
+            <w:vAlign w:val="center"/>
+          </w:tcPr>
+          <w:p>
+            <w:pPr>
+              <w:spacing w:after="0"/>
+            </w:pPr>
+            <w:r>
+              <w:rPr>
+                <w:sz w:val="14"/>
+              </w:rPr>
+              <w:t>QUAL</w:t>
+            </w:r>
+          </w:p>
+        </w:tc>
+        <w:tc>
+          <w:tcPr>
+            <w:tcW w:type="dxa" w:w="1818"/>
+            <w:vAlign w:val="center"/>
+          </w:tcPr>
+          <w:p>
+            <w:pPr>
+              <w:spacing w:after="0"/>
+            </w:pPr>
+            <w:r>
+              <w:rPr>
+                <w:sz w:val="14"/>
+              </w:rPr>
+              <w:t>Multi-turn exact value degraded from `amber:4821` to `4821`.</w:t>
+            </w:r>
+          </w:p>
+        </w:tc>
+        <w:tc>
+          <w:tcPr>
+            <w:tcW w:type="dxa" w:w="1818"/>
+            <w:vAlign w:val="center"/>
+          </w:tcPr>
+          <w:p>
+            <w:pPr>
+              <w:spacing w:after="0"/>
+            </w:pPr>
+            <w:r>
+              <w:rPr>
+                <w:sz w:val="14"/>
+              </w:rPr>
+              <w:t>Weak exact state retention.</w:t>
+            </w:r>
+          </w:p>
+        </w:tc>
+        <w:tc>
+          <w:tcPr>
+            <w:tcW w:type="dxa" w:w="1818"/>
+            <w:vAlign w:val="center"/>
+          </w:tcPr>
+          <w:p>
+            <w:pPr>
+              <w:spacing w:after="0"/>
+            </w:pPr>
+            <w:r>
+              <w:rPr>
+                <w:sz w:val="14"/>
+              </w:rPr>
+              <w:t>Retain 2-point cap; externalise critical state.</w:t>
+            </w:r>
+          </w:p>
+        </w:tc>
+        <w:tc>
+          <w:tcPr>
+            <w:tcW w:type="dxa" w:w="1818"/>
+            <w:vAlign w:val="center"/>
+          </w:tcPr>
+          <w:p>
+            <w:pPr>
+              <w:spacing w:after="0"/>
+            </w:pPr>
+            <w:r>
+              <w:rPr>
+                <w:sz w:val="14"/>
+              </w:rPr>
+              <w:t>No</w:t>
+            </w:r>
+          </w:p>
+        </w:tc>
+        <w:tc>
+          <w:tcPr>
+            <w:tcW w:type="dxa" w:w="1818"/>
+            <w:vAlign w:val="center"/>
+          </w:tcPr>
+          <w:p>
+            <w:pPr>
+              <w:spacing w:after="0"/>
+            </w:pPr>
+            <w:r>
+              <w:rPr>
+                <w:sz w:val="14"/>
+              </w:rPr>
+              <w:t>experiments/granite_turboquant_intel/logs/upstream-llama-cpp/UL-05/UL-05-P6-R001/P6-turn2-with-history-stdout.txt</w:t>
+            </w:r>
+          </w:p>
+        </w:tc>
+      </w:tr>
+      <w:tr>
+        <w:trPr>
+          <w:cantSplit/>
+        </w:trPr>
+        <w:tc>
+          <w:tcPr>
+            <w:tcW w:type="dxa" w:w="1818"/>
+            <w:vAlign w:val="center"/>
+            <w:shd w:fill="EAF2F8"/>
+          </w:tcPr>
+          <w:p>
+            <w:pPr>
+              <w:spacing w:after="0"/>
+            </w:pPr>
+            <w:r>
+              <w:rPr>
+                <w:sz w:val="14"/>
+              </w:rPr>
+              <w:t>UL-F06</w:t>
+            </w:r>
+          </w:p>
+        </w:tc>
+        <w:tc>
+          <w:tcPr>
+            <w:tcW w:type="dxa" w:w="1818"/>
+            <w:vAlign w:val="center"/>
+            <w:shd w:fill="EAF2F8"/>
+          </w:tcPr>
+          <w:p>
+            <w:pPr>
+              <w:spacing w:after="0"/>
+            </w:pPr>
+            <w:r>
+              <w:rPr>
+                <w:sz w:val="14"/>
+              </w:rPr>
+              <w:t>UL-10/UL-12</w:t>
+            </w:r>
+          </w:p>
+        </w:tc>
+        <w:tc>
+          <w:tcPr>
+            <w:tcW w:type="dxa" w:w="1818"/>
+            <w:vAlign w:val="center"/>
+            <w:shd w:fill="EAF2F8"/>
+          </w:tcPr>
+          <w:p>
+            <w:pPr>
+              <w:spacing w:after="0"/>
+            </w:pPr>
+            <w:r>
+              <w:rPr>
+                <w:sz w:val="14"/>
+              </w:rPr>
+              <w:t>PERF</w:t>
+            </w:r>
+          </w:p>
+        </w:tc>
+        <w:tc>
+          <w:tcPr>
+            <w:tcW w:type="dxa" w:w="1818"/>
+            <w:vAlign w:val="center"/>
+            <w:shd w:fill="EAF2F8"/>
+          </w:tcPr>
+          <w:p>
+            <w:pPr>
+              <w:spacing w:after="0"/>
+            </w:pPr>
+            <w:r>
+              <w:rPr>
+                <w:sz w:val="14"/>
+              </w:rPr>
+              <w:t>Full Vulkan offload reduced decode throughput relative to one-layer offload.</w:t>
+            </w:r>
+          </w:p>
+        </w:tc>
+        <w:tc>
+          <w:tcPr>
+            <w:tcW w:type="dxa" w:w="1818"/>
+            <w:vAlign w:val="center"/>
+            <w:shd w:fill="EAF2F8"/>
+          </w:tcPr>
+          <w:p>
+            <w:pPr>
+              <w:spacing w:after="0"/>
+            </w:pPr>
+            <w:r>
+              <w:rPr>
+                <w:sz w:val="14"/>
+              </w:rPr>
+              <w:t>Integrated GPU is better used for prefill than full interactive decode.</w:t>
+            </w:r>
+          </w:p>
+        </w:tc>
+        <w:tc>
+          <w:tcPr>
+            <w:tcW w:type="dxa" w:w="1818"/>
+            <w:vAlign w:val="center"/>
+            <w:shd w:fill="EAF2F8"/>
+          </w:tcPr>
+          <w:p>
+            <w:pPr>
+              <w:spacing w:after="0"/>
+            </w:pPr>
+            <w:r>
+              <w:rPr>
+                <w:sz w:val="14"/>
+              </w:rPr>
+              <w:t>Prefer one-layer Vulkan for interactive workloads.</w:t>
+            </w:r>
+          </w:p>
+        </w:tc>
+        <w:tc>
+          <w:tcPr>
+            <w:tcW w:type="dxa" w:w="1818"/>
+            <w:vAlign w:val="center"/>
+            <w:shd w:fill="EAF2F8"/>
+          </w:tcPr>
+          <w:p>
+            <w:pPr>
+              <w:spacing w:after="0"/>
+            </w:pPr>
+            <w:r>
+              <w:rPr>
+                <w:sz w:val="14"/>
+              </w:rPr>
+              <w:t>Configuration issue, not test failure</w:t>
+            </w:r>
+          </w:p>
+        </w:tc>
+        <w:tc>
+          <w:tcPr>
+            <w:tcW w:type="dxa" w:w="1818"/>
+            <w:vAlign w:val="center"/>
+            <w:shd w:fill="EAF2F8"/>
+          </w:tcPr>
+          <w:p>
+            <w:pPr>
+              <w:spacing w:after="0"/>
+            </w:pPr>
+            <w:r>
+              <w:rPr>
+                <w:sz w:val="14"/>
+              </w:rPr>
+              <w:t>experiments/granite_turboquant_intel/logs/upstream-llama-cpp/UL-10/UL-10-R001/bench-stdout.jsonl</w:t>
+            </w:r>
+          </w:p>
+        </w:tc>
+      </w:tr>
+      <w:tr>
+        <w:trPr>
+          <w:cantSplit/>
+        </w:trPr>
+        <w:tc>
+          <w:tcPr>
+            <w:tcW w:type="dxa" w:w="1818"/>
+            <w:vAlign w:val="center"/>
+          </w:tcPr>
+          <w:p>
+            <w:pPr>
+              <w:spacing w:after="0"/>
+            </w:pPr>
+            <w:r>
+              <w:rPr>
+                <w:sz w:val="14"/>
+              </w:rPr>
+              <w:t>UL-F07</w:t>
+            </w:r>
+          </w:p>
+        </w:tc>
+        <w:tc>
+          <w:tcPr>
+            <w:tcW w:type="dxa" w:w="1818"/>
+            <w:vAlign w:val="center"/>
+          </w:tcPr>
+          <w:p>
+            <w:pPr>
+              <w:spacing w:after="0"/>
+            </w:pPr>
+            <w:r>
+              <w:rPr>
+                <w:sz w:val="14"/>
+              </w:rPr>
+              <w:t>All formal runs</w:t>
+            </w:r>
+          </w:p>
+        </w:tc>
+        <w:tc>
+          <w:tcPr>
+            <w:tcW w:type="dxa" w:w="1818"/>
+            <w:vAlign w:val="center"/>
+          </w:tcPr>
+          <w:p>
+            <w:pPr>
+              <w:spacing w:after="0"/>
+            </w:pPr>
+            <w:r>
+              <w:rPr>
+                <w:sz w:val="14"/>
+              </w:rPr>
+              <w:t>MEM</w:t>
+            </w:r>
+          </w:p>
+        </w:tc>
+        <w:tc>
+          <w:tcPr>
+            <w:tcW w:type="dxa" w:w="1818"/>
+            <w:vAlign w:val="center"/>
+          </w:tcPr>
+          <w:p>
+            <w:pPr>
+              <w:spacing w:after="0"/>
+            </w:pPr>
+            <w:r>
+              <w:rPr>
+                <w:sz w:val="14"/>
+              </w:rPr>
+              <w:t>Initial run omitted peak RAM, KV MB and TTFT because llama-bench does not emit all three.</w:t>
+            </w:r>
+          </w:p>
+        </w:tc>
+        <w:tc>
+          <w:tcPr>
+            <w:tcW w:type="dxa" w:w="1818"/>
+            <w:vAlign w:val="center"/>
+          </w:tcPr>
+          <w:p>
+            <w:pPr>
+              <w:spacing w:after="0"/>
+            </w:pPr>
+            <w:r>
+              <w:rPr>
+                <w:sz w:val="14"/>
+              </w:rPr>
+              <w:t>Measurement-layer omission in the first harness.</w:t>
+            </w:r>
+          </w:p>
+        </w:tc>
+        <w:tc>
+          <w:tcPr>
+            <w:tcW w:type="dxa" w:w="1818"/>
+            <w:vAlign w:val="center"/>
+          </w:tcPr>
+          <w:p>
+            <w:pPr>
+              <w:spacing w:after="0"/>
+            </w:pPr>
+            <w:r>
+              <w:rPr>
+                <w:sz w:val="14"/>
+              </w:rPr>
+              <w:t>Added tested 100 ms process-tree RAM sampling, deduplicated runtime KV parsing and loaded llama-server request-initiation-to-first-streamed-token timing; reran every row three times.</w:t>
+            </w:r>
+          </w:p>
+        </w:tc>
+        <w:tc>
+          <w:tcPr>
+            <w:tcW w:type="dxa" w:w="1818"/>
+            <w:vAlign w:val="center"/>
+          </w:tcPr>
+          <w:p>
+            <w:pPr>
+              <w:spacing w:after="0"/>
+            </w:pPr>
+            <w:r>
+              <w:rPr>
+                <w:sz w:val="14"/>
+              </w:rPr>
+              <w:t>Yes</w:t>
+            </w:r>
+          </w:p>
+        </w:tc>
+        <w:tc>
+          <w:tcPr>
+            <w:tcW w:type="dxa" w:w="1818"/>
+            <w:vAlign w:val="center"/>
+          </w:tcPr>
+          <w:p>
+            <w:pPr>
+              <w:spacing w:after="0"/>
+            </w:pPr>
+            <w:r>
+              <w:rPr>
+                <w:sz w:val="14"/>
+              </w:rPr>
+              <w:t>experiments/granite_turboquant_intel/processed-results/upstream-llama-cpp/resource-metrics-2026-07-16.json</w:t>
             </w:r>
           </w:p>
         </w:tc>
@@ -14074,6 +15102,7 @@
               <w:rPr>
                 <w:sz w:val="14"/>
               </w:rPr>
+              <w:t>UL-03 Q8_0 weights, F16 KV, CPU: 11.393 decode tok/s, 20.643 prompt tok/s, quality 8.9/10.</w:t>
             </w:r>
           </w:p>
         </w:tc>
@@ -14114,6 +15143,7 @@
               <w:rPr>
                 <w:sz w:val="14"/>
               </w:rPr>
+              <w:t>UL-07 Q4_K_M weights, F16 KV, CPU: 7.087 decode tok/s, 16.189 prompt tok/s, quality 6.5/10.</w:t>
             </w:r>
           </w:p>
         </w:tc>
@@ -14152,6 +15182,7 @@
               <w:rPr>
                 <w:sz w:val="14"/>
               </w:rPr>
+              <w:t>UL-04 for speed: Granite 3B Q4_K_M, F16 KV, CPU; UL-03 when quality is primary.</w:t>
             </w:r>
           </w:p>
         </w:tc>
@@ -14192,6 +15223,7 @@
               <w:rPr>
                 <w:sz w:val="14"/>
               </w:rPr>
+              <w:t>UL-09 Granite 3B Q4_K_M, Q8 KV, Vulkan one-layer offload: 79.856 prompt and 15.214 decode tok/s.</w:t>
             </w:r>
           </w:p>
         </w:tc>
@@ -14230,6 +15262,7 @@
               <w:rPr>
                 <w:sz w:val="14"/>
               </w:rPr>
+              <w:t>16,384 tokens demonstrated on UL-05 P5; the formal performance matrix used at most 4,096.</w:t>
             </w:r>
           </w:p>
         </w:tc>
@@ -14270,6 +15303,7 @@
               <w:rPr>
                 <w:sz w:val="14"/>
               </w:rPr>
+              <w:t>UL-04 CPU F16 KV for throughput, or UL-03 CPU F16 KV for quality-sensitive work.</w:t>
             </w:r>
           </w:p>
         </w:tc>
@@ -14308,6 +15342,7 @@
               <w:rPr>
                 <w:sz w:val="14"/>
               </w:rPr>
+              <w:t>Conditional pass: all thirteen project workloads pass with complete RAM/KV/TTFT measurements; CPU and Vulkan suites pass 52/52; the broader SYCL suite retains three edge-case failures.</w:t>
             </w:r>
           </w:p>
         </w:tc>
@@ -14348,6 +15383,7 @@
               <w:rPr>
                 <w:sz w:val="14"/>
               </w:rPr>
+              <w:t>Use upstream llama.cpp as the conventional reference runtime and Vulkan one-layer route; SYCL is validated for this Granite workload but not for every upstream backend operation.</w:t>
             </w:r>
           </w:p>
         </w:tc>
@@ -14386,6 +15422,7 @@
               <w:rPr>
                 <w:sz w:val="14"/>
               </w:rPr>
+              <w:t>experiments/granite_turboquant_intel/logs/upstream-llama-cpp/ and experiments/granite_turboquant_intel/processed-results/upstream-llama-cpp/quality-scoring-2026-07-15.md</w:t>
             </w:r>
           </w:p>
         </w:tc>
@@ -14426,6 +15463,7 @@
               <w:rPr>
                 <w:sz w:val="14"/>
               </w:rPr>
+              <w:t>Q8_0 3B is the quality reference. Q4_K_M/F16 KV is the CPU speed choice. Q8 KV materially reduces allocation but sharply harms prefill here. One-layer Vulkan gives the best interactive balance. Full Vulkan offload regresses decode and raises RAM. SYCL project inference passes but is slower and retains three unrelated edge-suite failures.</w:t>
             </w:r>
           </w:p>
         </w:tc>

</xml_diff>